<commit_message>
docs: informe 15-abr actualizado con audit UX/UI + copy fixes
</commit_message>
<xml_diff>
--- a/docs/Informe_Estatus_2026-04-15.docx
+++ b/docs/Informe_Estatus_2026-04-15.docx
@@ -862,6 +862,416 @@
       </w:tr>
     </w:tbl>
     <w:p/>
+    <w:p>
+      <w:pPr>
+        <w:pStyle w:val="Ttulo3"/>
+      </w:pPr>
+      <w:r>
+        <w:t>Audit UX/UI — Copy y Messaging</w:t>
+      </w:r>
+    </w:p>
+    <w:p>
+      <w:pPr>
+        <w:pStyle w:val="FirstParagraph"/>
+      </w:pPr>
+      <w:r>
+        <w:t>Se realizó un segundo audit enfocado en UX/UI y messaging de la landing page. Se identificaron 7 puntos, de los cuales 3 fueron quick wins resueltos en la misma sesión:</w:t>
+      </w:r>
+    </w:p>
+    <w:tbl>
+      <w:tblPr>
+        <w:tblStyle w:val="Table"/>
+        <w:tblW w:type="auto" w:w="0"/>
+        <w:tblLook w:firstColumn="1" w:firstRow="1" w:lastColumn="0" w:lastRow="0" w:noHBand="0" w:noVBand="1" w:val="04A0"/>
+      </w:tblPr>
+      <w:tblGrid>
+        <w:gridCol w:w="2209"/>
+        <w:gridCol w:w="2209"/>
+        <w:gridCol w:w="2209"/>
+        <w:gridCol w:w="2209"/>
+      </w:tblGrid>
+      <w:tr>
+        <w:tc>
+          <w:tcPr>
+            <w:tcW w:type="dxa" w:w="2209"/>
+          </w:tcPr>
+          <w:p>
+            <w:r>
+              <w:rPr>
+                <w:b/>
+              </w:rPr>
+              <w:t>#</w:t>
+            </w:r>
+          </w:p>
+        </w:tc>
+        <w:tc>
+          <w:tcPr>
+            <w:tcW w:type="dxa" w:w="2209"/>
+          </w:tcPr>
+          <w:p>
+            <w:r>
+              <w:rPr>
+                <w:b/>
+              </w:rPr>
+              <w:t>Punto</w:t>
+            </w:r>
+          </w:p>
+        </w:tc>
+        <w:tc>
+          <w:tcPr>
+            <w:tcW w:type="dxa" w:w="2209"/>
+          </w:tcPr>
+          <w:p>
+            <w:r>
+              <w:rPr>
+                <w:b/>
+              </w:rPr>
+              <w:t>Veredicto</w:t>
+            </w:r>
+          </w:p>
+        </w:tc>
+        <w:tc>
+          <w:tcPr>
+            <w:tcW w:type="dxa" w:w="2209"/>
+          </w:tcPr>
+          <w:p>
+            <w:r>
+              <w:rPr>
+                <w:b/>
+              </w:rPr>
+              <w:t>Acción tomada</w:t>
+            </w:r>
+          </w:p>
+        </w:tc>
+      </w:tr>
+      <w:tr>
+        <w:tc>
+          <w:tcPr>
+            <w:tcW w:type="dxa" w:w="2209"/>
+          </w:tcPr>
+          <w:p>
+            <w:r>
+              <w:t>1</w:t>
+            </w:r>
+          </w:p>
+        </w:tc>
+        <w:tc>
+          <w:tcPr>
+            <w:tcW w:type="dxa" w:w="2209"/>
+          </w:tcPr>
+          <w:p>
+            <w:r>
+              <w:t>Nav links muertos</w:t>
+            </w:r>
+          </w:p>
+        </w:tc>
+        <w:tc>
+          <w:tcPr>
+            <w:tcW w:type="dxa" w:w="2209"/>
+          </w:tcPr>
+          <w:p>
+            <w:r>
+              <w:t>YA RESUELTO</w:t>
+            </w:r>
+          </w:p>
+        </w:tc>
+        <w:tc>
+          <w:tcPr>
+            <w:tcW w:type="dxa" w:w="2209"/>
+          </w:tcPr>
+          <w:p>
+            <w:r>
+              <w:t>Renombrado 'Precios'→'Estadísticas', eliminado 'FAQ', renombrado 'Entrar'→'Ver App'</w:t>
+            </w:r>
+          </w:p>
+        </w:tc>
+      </w:tr>
+      <w:tr>
+        <w:tc>
+          <w:tcPr>
+            <w:tcW w:type="dxa" w:w="2209"/>
+          </w:tcPr>
+          <w:p>
+            <w:r>
+              <w:t>2</w:t>
+            </w:r>
+          </w:p>
+        </w:tc>
+        <w:tc>
+          <w:tcPr>
+            <w:tcW w:type="dxa" w:w="2209"/>
+          </w:tcPr>
+          <w:p>
+            <w:r>
+              <w:t>Botón 'Entrar' sin auth</w:t>
+            </w:r>
+          </w:p>
+        </w:tc>
+        <w:tc>
+          <w:tcPr>
+            <w:tcW w:type="dxa" w:w="2209"/>
+          </w:tcPr>
+          <w:p>
+            <w:r>
+              <w:t>YA RESUELTO</w:t>
+            </w:r>
+          </w:p>
+        </w:tc>
+        <w:tc>
+          <w:tcPr>
+            <w:tcW w:type="dxa" w:w="2209"/>
+          </w:tcPr>
+          <w:p>
+            <w:r>
+              <w:t>Ver punto 1</w:t>
+            </w:r>
+          </w:p>
+        </w:tc>
+      </w:tr>
+      <w:tr>
+        <w:tc>
+          <w:tcPr>
+            <w:tcW w:type="dxa" w:w="2209"/>
+          </w:tcPr>
+          <w:p>
+            <w:r>
+              <w:t>3</w:t>
+            </w:r>
+          </w:p>
+        </w:tc>
+        <w:tc>
+          <w:tcPr>
+            <w:tcW w:type="dxa" w:w="2209"/>
+          </w:tcPr>
+          <w:p>
+            <w:r>
+              <w:t>'100% GRATIS' y 'Gratis para siempre' mienten pre-paywall</w:t>
+            </w:r>
+          </w:p>
+        </w:tc>
+        <w:tc>
+          <w:tcPr>
+            <w:tcW w:type="dxa" w:w="2209"/>
+          </w:tcPr>
+          <w:p>
+            <w:r>
+              <w:t>RESUELTO</w:t>
+            </w:r>
+          </w:p>
+        </w:tc>
+        <w:tc>
+          <w:tcPr>
+            <w:tcW w:type="dxa" w:w="2209"/>
+          </w:tcPr>
+          <w:p>
+            <w:r>
+              <w:t>Cambiado a 'EMPEZÁ GRATIS', 'Empezá gratis', 'Sin registro · Sin tarjeta · Resultado en minutos'</w:t>
+            </w:r>
+          </w:p>
+        </w:tc>
+      </w:tr>
+      <w:tr>
+        <w:tc>
+          <w:tcPr>
+            <w:tcW w:type="dxa" w:w="2209"/>
+          </w:tcPr>
+          <w:p>
+            <w:r>
+              <w:t>4</w:t>
+            </w:r>
+          </w:p>
+        </w:tc>
+        <w:tc>
+          <w:tcPr>
+            <w:tcW w:type="dxa" w:w="2209"/>
+          </w:tcPr>
+          <w:p>
+            <w:r>
+              <w:t>'Vista previa de tu futuro dashboard'</w:t>
+            </w:r>
+          </w:p>
+        </w:tc>
+        <w:tc>
+          <w:tcPr>
+            <w:tcW w:type="dxa" w:w="2209"/>
+          </w:tcPr>
+          <w:p>
+            <w:r>
+              <w:t>RESUELTO</w:t>
+            </w:r>
+          </w:p>
+        </w:tc>
+        <w:tc>
+          <w:tcPr>
+            <w:tcW w:type="dxa" w:w="2209"/>
+          </w:tcPr>
+          <w:p>
+            <w:r>
+              <w:t>Cambiado a 'Así se ve tu dashboard personalizado' (presente, no futuro)</w:t>
+            </w:r>
+          </w:p>
+        </w:tc>
+      </w:tr>
+      <w:tr>
+        <w:tc>
+          <w:tcPr>
+            <w:tcW w:type="dxa" w:w="2209"/>
+          </w:tcPr>
+          <w:p>
+            <w:r>
+              <w:t>5</w:t>
+            </w:r>
+          </w:p>
+        </w:tc>
+        <w:tc>
+          <w:tcPr>
+            <w:tcW w:type="dxa" w:w="2209"/>
+          </w:tcPr>
+          <w:p>
+            <w:r>
+              <w:t>16 tabs cognitivamente abrumadoras</w:t>
+            </w:r>
+          </w:p>
+        </w:tc>
+        <w:tc>
+          <w:tcPr>
+            <w:tcW w:type="dxa" w:w="2209"/>
+          </w:tcPr>
+          <w:p>
+            <w:r>
+              <w:t>DIFERIDO</w:t>
+            </w:r>
+          </w:p>
+        </w:tc>
+        <w:tc>
+          <w:tcPr>
+            <w:tcW w:type="dxa" w:w="2209"/>
+          </w:tcPr>
+          <w:p>
+            <w:r>
+              <w:t>Roadmap Fase 3: flujo guiado / wizard de onboarding</w:t>
+            </w:r>
+          </w:p>
+        </w:tc>
+      </w:tr>
+      <w:tr>
+        <w:tc>
+          <w:tcPr>
+            <w:tcW w:type="dxa" w:w="2209"/>
+          </w:tcPr>
+          <w:p>
+            <w:r>
+              <w:t>6</w:t>
+            </w:r>
+          </w:p>
+        </w:tc>
+        <w:tc>
+          <w:tcPr>
+            <w:tcW w:type="dxa" w:w="2209"/>
+          </w:tcPr>
+          <w:p>
+            <w:r>
+              <w:t>Momento del paywall no diseñado</w:t>
+            </w:r>
+          </w:p>
+        </w:tc>
+        <w:tc>
+          <w:tcPr>
+            <w:tcW w:type="dxa" w:w="2209"/>
+          </w:tcPr>
+          <w:p>
+            <w:r>
+              <w:t>DIFERIDO</w:t>
+            </w:r>
+          </w:p>
+        </w:tc>
+        <w:tc>
+          <w:tcPr>
+            <w:tcW w:type="dxa" w:w="2209"/>
+          </w:tcPr>
+          <w:p>
+            <w:r>
+              <w:t>Requiere implementación de Stripe (Fase 4)</w:t>
+            </w:r>
+          </w:p>
+        </w:tc>
+      </w:tr>
+      <w:tr>
+        <w:tc>
+          <w:tcPr>
+            <w:tcW w:type="dxa" w:w="2209"/>
+          </w:tcPr>
+          <w:p>
+            <w:r>
+              <w:t>7</w:t>
+            </w:r>
+          </w:p>
+        </w:tc>
+        <w:tc>
+          <w:tcPr>
+            <w:tcW w:type="dxa" w:w="2209"/>
+          </w:tcPr>
+          <w:p>
+            <w:r>
+              <w:t>Voseo argentino en producto LATAM</w:t>
+            </w:r>
+          </w:p>
+        </w:tc>
+        <w:tc>
+          <w:tcPr>
+            <w:tcW w:type="dxa" w:w="2209"/>
+          </w:tcPr>
+          <w:p>
+            <w:r>
+              <w:t>INTENCIONAL</w:t>
+            </w:r>
+          </w:p>
+        </w:tc>
+        <w:tc>
+          <w:tcPr>
+            <w:tcW w:type="dxa" w:w="2209"/>
+          </w:tcPr>
+          <w:p>
+            <w:r>
+              <w:t>Decisión de marca mantenida — señala identidad argentina</w:t>
+            </w:r>
+          </w:p>
+        </w:tc>
+      </w:tr>
+    </w:tbl>
+    <w:p/>
+    <w:p>
+      <w:pPr>
+        <w:pStyle w:val="FirstParagraph"/>
+      </w:pPr>
+      <w:r>
+        <w:t>Cambio estratégico de CTA:</w:t>
+      </w:r>
+    </w:p>
+    <w:p>
+      <w:pPr>
+        <w:pStyle w:val="Compact"/>
+      </w:pPr>
+      <w:r>
+        <w:t>ANTES: 'Calcular mi número — es gratis' → AHORA: 'Calculá en 3 minutos cuánto necesitás'</w:t>
+      </w:r>
+    </w:p>
+    <w:p>
+      <w:pPr>
+        <w:pStyle w:val="Compact"/>
+      </w:pPr>
+      <w:r>
+        <w:t>ANTES: 'Empezar gratis ahora' → AHORA: 'Calculá tu Magic Number'</w:t>
+      </w:r>
+    </w:p>
+    <w:p>
+      <w:pPr>
+        <w:pStyle w:val="Textoindependiente"/>
+      </w:pPr>
+      <w:r>
+        <w:t>Fundamento: El CTA ahora comunica el resultado específico y el tiempo requerido, en lugar de enfatizar la gratuidad. Esto reduce la incertidumbre del usuario ('¿cuánto tardo?', '¿qué obtengo?') y es compatible con el futuro paywall.</w:t>
+      </w:r>
+    </w:p>
     <w:p/>
     <w:p>
       <w:pPr>

</xml_diff>

<commit_message>
docs: informe final 15-abr + commits log + resumen UX completo
</commit_message>
<xml_diff>
--- a/docs/Informe_Estatus_2026-04-15.docx
+++ b/docs/Informe_Estatus_2026-04-15.docx
@@ -3017,6 +3017,260 @@
         <w:pStyle w:val="Ttulo2"/>
       </w:pPr>
       <w:r>
+        <w:t>Commits del 15 de Abril (6 en total)</w:t>
+      </w:r>
+    </w:p>
+    <w:tbl>
+      <w:tblPr>
+        <w:tblStyle w:val="Table"/>
+        <w:tblW w:type="auto" w:w="0"/>
+        <w:tblLook w:firstColumn="1" w:firstRow="1" w:lastColumn="0" w:lastRow="0" w:noHBand="0" w:noVBand="1" w:val="04A0"/>
+      </w:tblPr>
+      <w:tblGrid>
+        <w:gridCol w:w="2946"/>
+        <w:gridCol w:w="2946"/>
+        <w:gridCol w:w="2946"/>
+      </w:tblGrid>
+      <w:tr>
+        <w:tc>
+          <w:tcPr>
+            <w:tcW w:type="dxa" w:w="2946"/>
+          </w:tcPr>
+          <w:p>
+            <w:r>
+              <w:rPr>
+                <w:b/>
+              </w:rPr>
+              <w:t>#</w:t>
+            </w:r>
+          </w:p>
+        </w:tc>
+        <w:tc>
+          <w:tcPr>
+            <w:tcW w:type="dxa" w:w="2946"/>
+          </w:tcPr>
+          <w:p>
+            <w:r>
+              <w:rPr>
+                <w:b/>
+              </w:rPr>
+              <w:t>Hash</w:t>
+            </w:r>
+          </w:p>
+        </w:tc>
+        <w:tc>
+          <w:tcPr>
+            <w:tcW w:type="dxa" w:w="2946"/>
+          </w:tcPr>
+          <w:p>
+            <w:r>
+              <w:rPr>
+                <w:b/>
+              </w:rPr>
+              <w:t>Descripción</w:t>
+            </w:r>
+          </w:p>
+        </w:tc>
+      </w:tr>
+      <w:tr>
+        <w:tc>
+          <w:tcPr>
+            <w:tcW w:type="dxa" w:w="2946"/>
+          </w:tcPr>
+          <w:p>
+            <w:r>
+              <w:t>1</w:t>
+            </w:r>
+          </w:p>
+        </w:tc>
+        <w:tc>
+          <w:tcPr>
+            <w:tcW w:type="dxa" w:w="2946"/>
+          </w:tcPr>
+          <w:p>
+            <w:r>
+              <w:t>5475d3e</w:t>
+            </w:r>
+          </w:p>
+        </w:tc>
+        <w:tc>
+          <w:tcPr>
+            <w:tcW w:type="dxa" w:w="2946"/>
+          </w:tcPr>
+          <w:p>
+            <w:r>
+              <w:t>fix: crash por localStorage corrupto + modal blanco + validacion tel + sanitizacion store</w:t>
+            </w:r>
+          </w:p>
+        </w:tc>
+      </w:tr>
+      <w:tr>
+        <w:tc>
+          <w:tcPr>
+            <w:tcW w:type="dxa" w:w="2946"/>
+          </w:tcPr>
+          <w:p>
+            <w:r>
+              <w:t>2</w:t>
+            </w:r>
+          </w:p>
+        </w:tc>
+        <w:tc>
+          <w:tcPr>
+            <w:tcW w:type="dxa" w:w="2946"/>
+          </w:tcPr>
+          <w:p>
+            <w:r>
+              <w:t>335d3cd</w:t>
+            </w:r>
+          </w:p>
+        </w:tc>
+        <w:tc>
+          <w:tcPr>
+            <w:tcW w:type="dxa" w:w="2946"/>
+          </w:tcPr>
+          <w:p>
+            <w:r>
+              <w:t>fix: landing nav - rename stale links + remove fake FAQ + add status report 15-abr</w:t>
+            </w:r>
+          </w:p>
+        </w:tc>
+      </w:tr>
+      <w:tr>
+        <w:tc>
+          <w:tcPr>
+            <w:tcW w:type="dxa" w:w="2946"/>
+          </w:tcPr>
+          <w:p>
+            <w:r>
+              <w:t>3</w:t>
+            </w:r>
+          </w:p>
+        </w:tc>
+        <w:tc>
+          <w:tcPr>
+            <w:tcW w:type="dxa" w:w="2946"/>
+          </w:tcPr>
+          <w:p>
+            <w:r>
+              <w:t>028ab07</w:t>
+            </w:r>
+          </w:p>
+        </w:tc>
+        <w:tc>
+          <w:tcPr>
+            <w:tcW w:type="dxa" w:w="2946"/>
+          </w:tcPr>
+          <w:p>
+            <w:r>
+              <w:t>copy: landing freemium-honest + CTA orientado a resultado + dashboard presente</w:t>
+            </w:r>
+          </w:p>
+        </w:tc>
+      </w:tr>
+      <w:tr>
+        <w:tc>
+          <w:tcPr>
+            <w:tcW w:type="dxa" w:w="2946"/>
+          </w:tcPr>
+          <w:p>
+            <w:r>
+              <w:t>4</w:t>
+            </w:r>
+          </w:p>
+        </w:tc>
+        <w:tc>
+          <w:tcPr>
+            <w:tcW w:type="dxa" w:w="2946"/>
+          </w:tcPr>
+          <w:p>
+            <w:r>
+              <w:t>41dbaab</w:t>
+            </w:r>
+          </w:p>
+        </w:tc>
+        <w:tc>
+          <w:tcPr>
+            <w:tcW w:type="dxa" w:w="2946"/>
+          </w:tcPr>
+          <w:p>
+            <w:r>
+              <w:t>docs: informe 15-abr actualizado con audit UX/UI + copy fixes</w:t>
+            </w:r>
+          </w:p>
+        </w:tc>
+      </w:tr>
+      <w:tr>
+        <w:tc>
+          <w:tcPr>
+            <w:tcW w:type="dxa" w:w="2946"/>
+          </w:tcPr>
+          <w:p>
+            <w:r>
+              <w:t>5</w:t>
+            </w:r>
+          </w:p>
+        </w:tc>
+        <w:tc>
+          <w:tcPr>
+            <w:tcW w:type="dxa" w:w="2946"/>
+          </w:tcPr>
+          <w:p>
+            <w:r>
+              <w:t>51e2283</w:t>
+            </w:r>
+          </w:p>
+        </w:tc>
+        <w:tc>
+          <w:tcPr>
+            <w:tcW w:type="dxa" w:w="2946"/>
+          </w:tcPr>
+          <w:p>
+            <w:r>
+              <w:t>ui: remove duplicate Ver App button from nav</w:t>
+            </w:r>
+          </w:p>
+        </w:tc>
+      </w:tr>
+      <w:tr>
+        <w:tc>
+          <w:tcPr>
+            <w:tcW w:type="dxa" w:w="2946"/>
+          </w:tcPr>
+          <w:p>
+            <w:r>
+              <w:t>6</w:t>
+            </w:r>
+          </w:p>
+        </w:tc>
+        <w:tc>
+          <w:tcPr>
+            <w:tcW w:type="dxa" w:w="2946"/>
+          </w:tcPr>
+          <w:p>
+            <w:r>
+              <w:t>e3368c0</w:t>
+            </w:r>
+          </w:p>
+        </w:tc>
+        <w:tc>
+          <w:tcPr>
+            <w:tcW w:type="dxa" w:w="2946"/>
+          </w:tcPr>
+          <w:p>
+            <w:r>
+              <w:t>feat: simulator tracking + email CTA copy + paid upgrade toast</w:t>
+            </w:r>
+          </w:p>
+        </w:tc>
+      </w:tr>
+    </w:tbl>
+    <w:p/>
+    <w:p>
+      <w:pPr>
+        <w:pStyle w:val="Ttulo2"/>
+      </w:pPr>
+      <w:r>
         <w:t>Decisiones Pendientes del Equipo</w:t>
       </w:r>
     </w:p>
@@ -3063,10 +3317,344 @@
     <w:p/>
     <w:p>
       <w:pPr>
+        <w:pStyle w:val="Ttulo2"/>
+      </w:pPr>
+      <w:r>
+        <w:t>Estado UX/UI — Resumen Final</w:t>
+      </w:r>
+    </w:p>
+    <w:tbl>
+      <w:tblPr>
+        <w:tblStyle w:val="Table"/>
+        <w:tblW w:type="auto" w:w="0"/>
+        <w:tblLook w:firstColumn="1" w:firstRow="1" w:lastColumn="0" w:lastRow="0" w:noHBand="0" w:noVBand="1" w:val="04A0"/>
+      </w:tblPr>
+      <w:tblGrid>
+        <w:gridCol w:w="4419"/>
+        <w:gridCol w:w="4419"/>
+      </w:tblGrid>
+      <w:tr>
+        <w:tc>
+          <w:tcPr>
+            <w:tcW w:type="dxa" w:w="4419"/>
+          </w:tcPr>
+          <w:p>
+            <w:r>
+              <w:rPr>
+                <w:b/>
+              </w:rPr>
+              <w:t>Punto</w:t>
+            </w:r>
+          </w:p>
+        </w:tc>
+        <w:tc>
+          <w:tcPr>
+            <w:tcW w:type="dxa" w:w="4419"/>
+          </w:tcPr>
+          <w:p>
+            <w:r>
+              <w:rPr>
+                <w:b/>
+              </w:rPr>
+              <w:t>Estado</w:t>
+            </w:r>
+          </w:p>
+        </w:tc>
+      </w:tr>
+      <w:tr>
+        <w:tc>
+          <w:tcPr>
+            <w:tcW w:type="dxa" w:w="4419"/>
+          </w:tcPr>
+          <w:p>
+            <w:r>
+              <w:t>Emojis → íconos Phosphor</w:t>
+            </w:r>
+          </w:p>
+        </w:tc>
+        <w:tc>
+          <w:tcPr>
+            <w:tcW w:type="dxa" w:w="4419"/>
+          </w:tcPr>
+          <w:p>
+            <w:r>
+              <w:t>✅ Completado</w:t>
+            </w:r>
+          </w:p>
+        </w:tc>
+      </w:tr>
+      <w:tr>
+        <w:tc>
+          <w:tcPr>
+            <w:tcW w:type="dxa" w:w="4419"/>
+          </w:tcPr>
+          <w:p>
+            <w:r>
+              <w:t>Nav links honestos</w:t>
+            </w:r>
+          </w:p>
+        </w:tc>
+        <w:tc>
+          <w:tcPr>
+            <w:tcW w:type="dxa" w:w="4419"/>
+          </w:tcPr>
+          <w:p>
+            <w:r>
+              <w:t>✅ Corregido</w:t>
+            </w:r>
+          </w:p>
+        </w:tc>
+      </w:tr>
+      <w:tr>
+        <w:tc>
+          <w:tcPr>
+            <w:tcW w:type="dxa" w:w="4419"/>
+          </w:tcPr>
+          <w:p>
+            <w:r>
+              <w:t>CTA messaging freemium-honest</w:t>
+            </w:r>
+          </w:p>
+        </w:tc>
+        <w:tc>
+          <w:tcPr>
+            <w:tcW w:type="dxa" w:w="4419"/>
+          </w:tcPr>
+          <w:p>
+            <w:r>
+              <w:t>✅ Corregido</w:t>
+            </w:r>
+          </w:p>
+        </w:tc>
+      </w:tr>
+      <w:tr>
+        <w:tc>
+          <w:tcPr>
+            <w:tcW w:type="dxa" w:w="4419"/>
+          </w:tcPr>
+          <w:p>
+            <w:r>
+              <w:t>Free tier invisible (no locked)</w:t>
+            </w:r>
+          </w:p>
+        </w:tc>
+        <w:tc>
+          <w:tcPr>
+            <w:tcW w:type="dxa" w:w="4419"/>
+          </w:tcPr>
+          <w:p>
+            <w:r>
+              <w:t>✅ Excelente</w:t>
+            </w:r>
+          </w:p>
+        </w:tc>
+      </w:tr>
+      <w:tr>
+        <w:tc>
+          <w:tcPr>
+            <w:tcW w:type="dxa" w:w="4419"/>
+          </w:tcPr>
+          <w:p>
+            <w:r>
+              <w:t>CTA hierarchy (email &gt; pago)</w:t>
+            </w:r>
+          </w:p>
+        </w:tc>
+        <w:tc>
+          <w:tcPr>
+            <w:tcW w:type="dxa" w:w="4419"/>
+          </w:tcPr>
+          <w:p>
+            <w:r>
+              <w:t>✅ Correcto</w:t>
+            </w:r>
+          </w:p>
+        </w:tc>
+      </w:tr>
+      <w:tr>
+        <w:tc>
+          <w:tcPr>
+            <w:tcW w:type="dxa" w:w="4419"/>
+          </w:tcPr>
+          <w:p>
+            <w:r>
+              <w:t>Simulador 3 palancas visual</w:t>
+            </w:r>
+          </w:p>
+        </w:tc>
+        <w:tc>
+          <w:tcPr>
+            <w:tcW w:type="dxa" w:w="4419"/>
+          </w:tcPr>
+          <w:p>
+            <w:r>
+              <w:t>✅ A buen nivel</w:t>
+            </w:r>
+          </w:p>
+        </w:tc>
+      </w:tr>
+      <w:tr>
+        <w:tc>
+          <w:tcPr>
+            <w:tcW w:type="dxa" w:w="4419"/>
+          </w:tcPr>
+          <w:p>
+            <w:r>
+              <w:t>Timing del gold card post-engagement</w:t>
+            </w:r>
+          </w:p>
+        </w:tc>
+        <w:tc>
+          <w:tcPr>
+            <w:tcW w:type="dxa" w:w="4419"/>
+          </w:tcPr>
+          <w:p>
+            <w:r>
+              <w:t>✅ Correcto</w:t>
+            </w:r>
+          </w:p>
+        </w:tc>
+      </w:tr>
+      <w:tr>
+        <w:tc>
+          <w:tcPr>
+            <w:tcW w:type="dxa" w:w="4419"/>
+          </w:tcPr>
+          <w:p>
+            <w:r>
+              <w:t>Email CTA copy específico</w:t>
+            </w:r>
+          </w:p>
+        </w:tc>
+        <w:tc>
+          <w:tcPr>
+            <w:tcW w:type="dxa" w:w="4419"/>
+          </w:tcPr>
+          <w:p>
+            <w:r>
+              <w:t>✅ Implementado</w:t>
+            </w:r>
+          </w:p>
+        </w:tc>
+      </w:tr>
+      <w:tr>
+        <w:tc>
+          <w:tcPr>
+            <w:tcW w:type="dxa" w:w="4419"/>
+          </w:tcPr>
+          <w:p>
+            <w:r>
+              <w:t>SIMULATOR_INTERACTION analytics</w:t>
+            </w:r>
+          </w:p>
+        </w:tc>
+        <w:tc>
+          <w:tcPr>
+            <w:tcW w:type="dxa" w:w="4419"/>
+          </w:tcPr>
+          <w:p>
+            <w:r>
+              <w:t>✅ Implementado</w:t>
+            </w:r>
+          </w:p>
+        </w:tc>
+      </w:tr>
+      <w:tr>
+        <w:tc>
+          <w:tcPr>
+            <w:tcW w:type="dxa" w:w="4419"/>
+          </w:tcPr>
+          <w:p>
+            <w:r>
+              <w:t>Toast de bienvenida paid upgrade</w:t>
+            </w:r>
+          </w:p>
+        </w:tc>
+        <w:tc>
+          <w:tcPr>
+            <w:tcW w:type="dxa" w:w="4419"/>
+          </w:tcPr>
+          <w:p>
+            <w:r>
+              <w:t>✅ Implementado</w:t>
+            </w:r>
+          </w:p>
+        </w:tc>
+      </w:tr>
+      <w:tr>
+        <w:tc>
+          <w:tcPr>
+            <w:tcW w:type="dxa" w:w="4419"/>
+          </w:tcPr>
+          <w:p>
+            <w:r>
+              <w:t>Botón duplicado 'Ver App' eliminado</w:t>
+            </w:r>
+          </w:p>
+        </w:tc>
+        <w:tc>
+          <w:tcPr>
+            <w:tcW w:type="dxa" w:w="4419"/>
+          </w:tcPr>
+          <w:p>
+            <w:r>
+              <w:t>✅ Resuelto</w:t>
+            </w:r>
+          </w:p>
+        </w:tc>
+      </w:tr>
+      <w:tr>
+        <w:tc>
+          <w:tcPr>
+            <w:tcW w:type="dxa" w:w="4419"/>
+          </w:tcPr>
+          <w:p>
+            <w:r>
+              <w:t>Onboarding wizard (16 tabs)</w:t>
+            </w:r>
+          </w:p>
+        </w:tc>
+        <w:tc>
+          <w:tcPr>
+            <w:tcW w:type="dxa" w:w="4419"/>
+          </w:tcPr>
+          <w:p>
+            <w:r>
+              <w:t>⏳ Fase 3</w:t>
+            </w:r>
+          </w:p>
+        </w:tc>
+      </w:tr>
+      <w:tr>
+        <w:tc>
+          <w:tcPr>
+            <w:tcW w:type="dxa" w:w="4419"/>
+          </w:tcPr>
+          <w:p>
+            <w:r>
+              <w:t>Diseño del paywall Stripe</w:t>
+            </w:r>
+          </w:p>
+        </w:tc>
+        <w:tc>
+          <w:tcPr>
+            <w:tcW w:type="dxa" w:w="4419"/>
+          </w:tcPr>
+          <w:p>
+            <w:r>
+              <w:t>⏳ Requiere Stripe</w:t>
+            </w:r>
+          </w:p>
+        </w:tc>
+      </w:tr>
+    </w:tbl>
+    <w:p/>
+    <w:p>
+      <w:pPr>
         <w:pStyle w:val="FirstParagraph"/>
       </w:pPr>
       <w:r>
-        <w:t>MaNu PRO completó su primera fase de maduración técnica. El código es modular, el deploy es estable, y los crashes críticos están resueltos. Lo que sigue es la experiencia del usuario: hacer que cualquier persona pueda llegar a su Magic Number sin perderse.</w:t>
+        <w:t>MaNu PRO completó su primera fase de maduración técnica y una extensa validación UX con dos auditorías independientes. El código es modular (14/16 tabs extraídas), el deploy es estable en Cloudflare Pages, los crashes críticos están resueltos con 3 capas de protección, y el modelo de 3 tiers (Free/Email/Paid) está validado como correcto en diseño y ejecución. Se implementaron 10+ quick wins de UX en una sola sesión. Lo que sigue: Stripe + Paywall como única prioridad que mueve el negocio.</w:t>
       </w:r>
     </w:p>
     <w:sectPr>

</xml_diff>

<commit_message>
docs: table borders visible in status report
</commit_message>
<xml_diff>
--- a/docs/Informe_Estatus_2026-04-15.docx
+++ b/docs/Informe_Estatus_2026-04-15.docx
@@ -75,6 +75,12 @@
         <w:tc>
           <w:tcPr>
             <w:tcW w:type="dxa" w:w="2946"/>
+            <w:tcBorders>
+              <w:top w:val="single" w:sz="4" w:space="0" w:color="000000"/>
+              <w:left w:val="single" w:sz="4" w:space="0" w:color="000000"/>
+              <w:bottom w:val="single" w:sz="4" w:space="0" w:color="000000"/>
+              <w:right w:val="single" w:sz="4" w:space="0" w:color="000000"/>
+            </w:tcBorders>
           </w:tcPr>
           <w:p>
             <w:r>
@@ -88,6 +94,12 @@
         <w:tc>
           <w:tcPr>
             <w:tcW w:type="dxa" w:w="2946"/>
+            <w:tcBorders>
+              <w:top w:val="single" w:sz="4" w:space="0" w:color="000000"/>
+              <w:left w:val="single" w:sz="4" w:space="0" w:color="000000"/>
+              <w:bottom w:val="single" w:sz="4" w:space="0" w:color="000000"/>
+              <w:right w:val="single" w:sz="4" w:space="0" w:color="000000"/>
+            </w:tcBorders>
           </w:tcPr>
           <w:p>
             <w:r>
@@ -101,6 +113,12 @@
         <w:tc>
           <w:tcPr>
             <w:tcW w:type="dxa" w:w="2946"/>
+            <w:tcBorders>
+              <w:top w:val="single" w:sz="4" w:space="0" w:color="000000"/>
+              <w:left w:val="single" w:sz="4" w:space="0" w:color="000000"/>
+              <w:bottom w:val="single" w:sz="4" w:space="0" w:color="000000"/>
+              <w:right w:val="single" w:sz="4" w:space="0" w:color="000000"/>
+            </w:tcBorders>
           </w:tcPr>
           <w:p>
             <w:r>
@@ -116,6 +134,12 @@
         <w:tc>
           <w:tcPr>
             <w:tcW w:type="dxa" w:w="2946"/>
+            <w:tcBorders>
+              <w:top w:val="single" w:sz="4" w:space="0" w:color="000000"/>
+              <w:left w:val="single" w:sz="4" w:space="0" w:color="000000"/>
+              <w:bottom w:val="single" w:sz="4" w:space="0" w:color="000000"/>
+              <w:right w:val="single" w:sz="4" w:space="0" w:color="000000"/>
+            </w:tcBorders>
           </w:tcPr>
           <w:p>
             <w:r>
@@ -126,6 +150,12 @@
         <w:tc>
           <w:tcPr>
             <w:tcW w:type="dxa" w:w="2946"/>
+            <w:tcBorders>
+              <w:top w:val="single" w:sz="4" w:space="0" w:color="000000"/>
+              <w:left w:val="single" w:sz="4" w:space="0" w:color="000000"/>
+              <w:bottom w:val="single" w:sz="4" w:space="0" w:color="000000"/>
+              <w:right w:val="single" w:sz="4" w:space="0" w:color="000000"/>
+            </w:tcBorders>
           </w:tcPr>
           <w:p>
             <w:r>
@@ -136,6 +166,12 @@
         <w:tc>
           <w:tcPr>
             <w:tcW w:type="dxa" w:w="2946"/>
+            <w:tcBorders>
+              <w:top w:val="single" w:sz="4" w:space="0" w:color="000000"/>
+              <w:left w:val="single" w:sz="4" w:space="0" w:color="000000"/>
+              <w:bottom w:val="single" w:sz="4" w:space="0" w:color="000000"/>
+              <w:right w:val="single" w:sz="4" w:space="0" w:color="000000"/>
+            </w:tcBorders>
           </w:tcPr>
           <w:p>
             <w:r>
@@ -148,6 +184,12 @@
         <w:tc>
           <w:tcPr>
             <w:tcW w:type="dxa" w:w="2946"/>
+            <w:tcBorders>
+              <w:top w:val="single" w:sz="4" w:space="0" w:color="000000"/>
+              <w:left w:val="single" w:sz="4" w:space="0" w:color="000000"/>
+              <w:bottom w:val="single" w:sz="4" w:space="0" w:color="000000"/>
+              <w:right w:val="single" w:sz="4" w:space="0" w:color="000000"/>
+            </w:tcBorders>
           </w:tcPr>
           <w:p>
             <w:r>
@@ -158,6 +200,12 @@
         <w:tc>
           <w:tcPr>
             <w:tcW w:type="dxa" w:w="2946"/>
+            <w:tcBorders>
+              <w:top w:val="single" w:sz="4" w:space="0" w:color="000000"/>
+              <w:left w:val="single" w:sz="4" w:space="0" w:color="000000"/>
+              <w:bottom w:val="single" w:sz="4" w:space="0" w:color="000000"/>
+              <w:right w:val="single" w:sz="4" w:space="0" w:color="000000"/>
+            </w:tcBorders>
           </w:tcPr>
           <w:p>
             <w:r>
@@ -168,6 +216,12 @@
         <w:tc>
           <w:tcPr>
             <w:tcW w:type="dxa" w:w="2946"/>
+            <w:tcBorders>
+              <w:top w:val="single" w:sz="4" w:space="0" w:color="000000"/>
+              <w:left w:val="single" w:sz="4" w:space="0" w:color="000000"/>
+              <w:bottom w:val="single" w:sz="4" w:space="0" w:color="000000"/>
+              <w:right w:val="single" w:sz="4" w:space="0" w:color="000000"/>
+            </w:tcBorders>
           </w:tcPr>
           <w:p>
             <w:r>
@@ -180,6 +234,12 @@
         <w:tc>
           <w:tcPr>
             <w:tcW w:type="dxa" w:w="2946"/>
+            <w:tcBorders>
+              <w:top w:val="single" w:sz="4" w:space="0" w:color="000000"/>
+              <w:left w:val="single" w:sz="4" w:space="0" w:color="000000"/>
+              <w:bottom w:val="single" w:sz="4" w:space="0" w:color="000000"/>
+              <w:right w:val="single" w:sz="4" w:space="0" w:color="000000"/>
+            </w:tcBorders>
           </w:tcPr>
           <w:p>
             <w:r>
@@ -190,6 +250,12 @@
         <w:tc>
           <w:tcPr>
             <w:tcW w:type="dxa" w:w="2946"/>
+            <w:tcBorders>
+              <w:top w:val="single" w:sz="4" w:space="0" w:color="000000"/>
+              <w:left w:val="single" w:sz="4" w:space="0" w:color="000000"/>
+              <w:bottom w:val="single" w:sz="4" w:space="0" w:color="000000"/>
+              <w:right w:val="single" w:sz="4" w:space="0" w:color="000000"/>
+            </w:tcBorders>
           </w:tcPr>
           <w:p>
             <w:r>
@@ -200,6 +266,12 @@
         <w:tc>
           <w:tcPr>
             <w:tcW w:type="dxa" w:w="2946"/>
+            <w:tcBorders>
+              <w:top w:val="single" w:sz="4" w:space="0" w:color="000000"/>
+              <w:left w:val="single" w:sz="4" w:space="0" w:color="000000"/>
+              <w:bottom w:val="single" w:sz="4" w:space="0" w:color="000000"/>
+              <w:right w:val="single" w:sz="4" w:space="0" w:color="000000"/>
+            </w:tcBorders>
           </w:tcPr>
           <w:p>
             <w:r>
@@ -212,6 +284,12 @@
         <w:tc>
           <w:tcPr>
             <w:tcW w:type="dxa" w:w="2946"/>
+            <w:tcBorders>
+              <w:top w:val="single" w:sz="4" w:space="0" w:color="000000"/>
+              <w:left w:val="single" w:sz="4" w:space="0" w:color="000000"/>
+              <w:bottom w:val="single" w:sz="4" w:space="0" w:color="000000"/>
+              <w:right w:val="single" w:sz="4" w:space="0" w:color="000000"/>
+            </w:tcBorders>
           </w:tcPr>
           <w:p>
             <w:r>
@@ -222,6 +300,12 @@
         <w:tc>
           <w:tcPr>
             <w:tcW w:type="dxa" w:w="2946"/>
+            <w:tcBorders>
+              <w:top w:val="single" w:sz="4" w:space="0" w:color="000000"/>
+              <w:left w:val="single" w:sz="4" w:space="0" w:color="000000"/>
+              <w:bottom w:val="single" w:sz="4" w:space="0" w:color="000000"/>
+              <w:right w:val="single" w:sz="4" w:space="0" w:color="000000"/>
+            </w:tcBorders>
           </w:tcPr>
           <w:p>
             <w:r>
@@ -232,6 +316,12 @@
         <w:tc>
           <w:tcPr>
             <w:tcW w:type="dxa" w:w="2946"/>
+            <w:tcBorders>
+              <w:top w:val="single" w:sz="4" w:space="0" w:color="000000"/>
+              <w:left w:val="single" w:sz="4" w:space="0" w:color="000000"/>
+              <w:bottom w:val="single" w:sz="4" w:space="0" w:color="000000"/>
+              <w:right w:val="single" w:sz="4" w:space="0" w:color="000000"/>
+            </w:tcBorders>
           </w:tcPr>
           <w:p>
             <w:r>
@@ -244,6 +334,12 @@
         <w:tc>
           <w:tcPr>
             <w:tcW w:type="dxa" w:w="2946"/>
+            <w:tcBorders>
+              <w:top w:val="single" w:sz="4" w:space="0" w:color="000000"/>
+              <w:left w:val="single" w:sz="4" w:space="0" w:color="000000"/>
+              <w:bottom w:val="single" w:sz="4" w:space="0" w:color="000000"/>
+              <w:right w:val="single" w:sz="4" w:space="0" w:color="000000"/>
+            </w:tcBorders>
           </w:tcPr>
           <w:p>
             <w:r>
@@ -254,6 +350,12 @@
         <w:tc>
           <w:tcPr>
             <w:tcW w:type="dxa" w:w="2946"/>
+            <w:tcBorders>
+              <w:top w:val="single" w:sz="4" w:space="0" w:color="000000"/>
+              <w:left w:val="single" w:sz="4" w:space="0" w:color="000000"/>
+              <w:bottom w:val="single" w:sz="4" w:space="0" w:color="000000"/>
+              <w:right w:val="single" w:sz="4" w:space="0" w:color="000000"/>
+            </w:tcBorders>
           </w:tcPr>
           <w:p>
             <w:r>
@@ -264,6 +366,12 @@
         <w:tc>
           <w:tcPr>
             <w:tcW w:type="dxa" w:w="2946"/>
+            <w:tcBorders>
+              <w:top w:val="single" w:sz="4" w:space="0" w:color="000000"/>
+              <w:left w:val="single" w:sz="4" w:space="0" w:color="000000"/>
+              <w:bottom w:val="single" w:sz="4" w:space="0" w:color="000000"/>
+              <w:right w:val="single" w:sz="4" w:space="0" w:color="000000"/>
+            </w:tcBorders>
           </w:tcPr>
           <w:p>
             <w:r>
@@ -345,6 +453,12 @@
         <w:tc>
           <w:tcPr>
             <w:tcW w:type="dxa" w:w="2946"/>
+            <w:tcBorders>
+              <w:top w:val="single" w:sz="4" w:space="0" w:color="000000"/>
+              <w:left w:val="single" w:sz="4" w:space="0" w:color="000000"/>
+              <w:bottom w:val="single" w:sz="4" w:space="0" w:color="000000"/>
+              <w:right w:val="single" w:sz="4" w:space="0" w:color="000000"/>
+            </w:tcBorders>
           </w:tcPr>
           <w:p>
             <w:r>
@@ -358,6 +472,12 @@
         <w:tc>
           <w:tcPr>
             <w:tcW w:type="dxa" w:w="2946"/>
+            <w:tcBorders>
+              <w:top w:val="single" w:sz="4" w:space="0" w:color="000000"/>
+              <w:left w:val="single" w:sz="4" w:space="0" w:color="000000"/>
+              <w:bottom w:val="single" w:sz="4" w:space="0" w:color="000000"/>
+              <w:right w:val="single" w:sz="4" w:space="0" w:color="000000"/>
+            </w:tcBorders>
           </w:tcPr>
           <w:p>
             <w:r>
@@ -371,6 +491,12 @@
         <w:tc>
           <w:tcPr>
             <w:tcW w:type="dxa" w:w="2946"/>
+            <w:tcBorders>
+              <w:top w:val="single" w:sz="4" w:space="0" w:color="000000"/>
+              <w:left w:val="single" w:sz="4" w:space="0" w:color="000000"/>
+              <w:bottom w:val="single" w:sz="4" w:space="0" w:color="000000"/>
+              <w:right w:val="single" w:sz="4" w:space="0" w:color="000000"/>
+            </w:tcBorders>
           </w:tcPr>
           <w:p>
             <w:r>
@@ -386,6 +512,12 @@
         <w:tc>
           <w:tcPr>
             <w:tcW w:type="dxa" w:w="2946"/>
+            <w:tcBorders>
+              <w:top w:val="single" w:sz="4" w:space="0" w:color="000000"/>
+              <w:left w:val="single" w:sz="4" w:space="0" w:color="000000"/>
+              <w:bottom w:val="single" w:sz="4" w:space="0" w:color="000000"/>
+              <w:right w:val="single" w:sz="4" w:space="0" w:color="000000"/>
+            </w:tcBorders>
           </w:tcPr>
           <w:p>
             <w:r>
@@ -396,6 +528,12 @@
         <w:tc>
           <w:tcPr>
             <w:tcW w:type="dxa" w:w="2946"/>
+            <w:tcBorders>
+              <w:top w:val="single" w:sz="4" w:space="0" w:color="000000"/>
+              <w:left w:val="single" w:sz="4" w:space="0" w:color="000000"/>
+              <w:bottom w:val="single" w:sz="4" w:space="0" w:color="000000"/>
+              <w:right w:val="single" w:sz="4" w:space="0" w:color="000000"/>
+            </w:tcBorders>
           </w:tcPr>
           <w:p>
             <w:r>
@@ -406,6 +544,12 @@
         <w:tc>
           <w:tcPr>
             <w:tcW w:type="dxa" w:w="2946"/>
+            <w:tcBorders>
+              <w:top w:val="single" w:sz="4" w:space="0" w:color="000000"/>
+              <w:left w:val="single" w:sz="4" w:space="0" w:color="000000"/>
+              <w:bottom w:val="single" w:sz="4" w:space="0" w:color="000000"/>
+              <w:right w:val="single" w:sz="4" w:space="0" w:color="000000"/>
+            </w:tcBorders>
           </w:tcPr>
           <w:p>
             <w:r>
@@ -418,6 +562,12 @@
         <w:tc>
           <w:tcPr>
             <w:tcW w:type="dxa" w:w="2946"/>
+            <w:tcBorders>
+              <w:top w:val="single" w:sz="4" w:space="0" w:color="000000"/>
+              <w:left w:val="single" w:sz="4" w:space="0" w:color="000000"/>
+              <w:bottom w:val="single" w:sz="4" w:space="0" w:color="000000"/>
+              <w:right w:val="single" w:sz="4" w:space="0" w:color="000000"/>
+            </w:tcBorders>
           </w:tcPr>
           <w:p>
             <w:r>
@@ -428,6 +578,12 @@
         <w:tc>
           <w:tcPr>
             <w:tcW w:type="dxa" w:w="2946"/>
+            <w:tcBorders>
+              <w:top w:val="single" w:sz="4" w:space="0" w:color="000000"/>
+              <w:left w:val="single" w:sz="4" w:space="0" w:color="000000"/>
+              <w:bottom w:val="single" w:sz="4" w:space="0" w:color="000000"/>
+              <w:right w:val="single" w:sz="4" w:space="0" w:color="000000"/>
+            </w:tcBorders>
           </w:tcPr>
           <w:p>
             <w:r>
@@ -438,6 +594,12 @@
         <w:tc>
           <w:tcPr>
             <w:tcW w:type="dxa" w:w="2946"/>
+            <w:tcBorders>
+              <w:top w:val="single" w:sz="4" w:space="0" w:color="000000"/>
+              <w:left w:val="single" w:sz="4" w:space="0" w:color="000000"/>
+              <w:bottom w:val="single" w:sz="4" w:space="0" w:color="000000"/>
+              <w:right w:val="single" w:sz="4" w:space="0" w:color="000000"/>
+            </w:tcBorders>
           </w:tcPr>
           <w:p>
             <w:r>
@@ -450,6 +612,12 @@
         <w:tc>
           <w:tcPr>
             <w:tcW w:type="dxa" w:w="2946"/>
+            <w:tcBorders>
+              <w:top w:val="single" w:sz="4" w:space="0" w:color="000000"/>
+              <w:left w:val="single" w:sz="4" w:space="0" w:color="000000"/>
+              <w:bottom w:val="single" w:sz="4" w:space="0" w:color="000000"/>
+              <w:right w:val="single" w:sz="4" w:space="0" w:color="000000"/>
+            </w:tcBorders>
           </w:tcPr>
           <w:p>
             <w:r>
@@ -460,6 +628,12 @@
         <w:tc>
           <w:tcPr>
             <w:tcW w:type="dxa" w:w="2946"/>
+            <w:tcBorders>
+              <w:top w:val="single" w:sz="4" w:space="0" w:color="000000"/>
+              <w:left w:val="single" w:sz="4" w:space="0" w:color="000000"/>
+              <w:bottom w:val="single" w:sz="4" w:space="0" w:color="000000"/>
+              <w:right w:val="single" w:sz="4" w:space="0" w:color="000000"/>
+            </w:tcBorders>
           </w:tcPr>
           <w:p>
             <w:r>
@@ -470,6 +644,12 @@
         <w:tc>
           <w:tcPr>
             <w:tcW w:type="dxa" w:w="2946"/>
+            <w:tcBorders>
+              <w:top w:val="single" w:sz="4" w:space="0" w:color="000000"/>
+              <w:left w:val="single" w:sz="4" w:space="0" w:color="000000"/>
+              <w:bottom w:val="single" w:sz="4" w:space="0" w:color="000000"/>
+              <w:right w:val="single" w:sz="4" w:space="0" w:color="000000"/>
+            </w:tcBorders>
           </w:tcPr>
           <w:p>
             <w:r>
@@ -482,6 +662,12 @@
         <w:tc>
           <w:tcPr>
             <w:tcW w:type="dxa" w:w="2946"/>
+            <w:tcBorders>
+              <w:top w:val="single" w:sz="4" w:space="0" w:color="000000"/>
+              <w:left w:val="single" w:sz="4" w:space="0" w:color="000000"/>
+              <w:bottom w:val="single" w:sz="4" w:space="0" w:color="000000"/>
+              <w:right w:val="single" w:sz="4" w:space="0" w:color="000000"/>
+            </w:tcBorders>
           </w:tcPr>
           <w:p>
             <w:r>
@@ -492,6 +678,12 @@
         <w:tc>
           <w:tcPr>
             <w:tcW w:type="dxa" w:w="2946"/>
+            <w:tcBorders>
+              <w:top w:val="single" w:sz="4" w:space="0" w:color="000000"/>
+              <w:left w:val="single" w:sz="4" w:space="0" w:color="000000"/>
+              <w:bottom w:val="single" w:sz="4" w:space="0" w:color="000000"/>
+              <w:right w:val="single" w:sz="4" w:space="0" w:color="000000"/>
+            </w:tcBorders>
           </w:tcPr>
           <w:p>
             <w:r>
@@ -502,6 +694,12 @@
         <w:tc>
           <w:tcPr>
             <w:tcW w:type="dxa" w:w="2946"/>
+            <w:tcBorders>
+              <w:top w:val="single" w:sz="4" w:space="0" w:color="000000"/>
+              <w:left w:val="single" w:sz="4" w:space="0" w:color="000000"/>
+              <w:bottom w:val="single" w:sz="4" w:space="0" w:color="000000"/>
+              <w:right w:val="single" w:sz="4" w:space="0" w:color="000000"/>
+            </w:tcBorders>
           </w:tcPr>
           <w:p>
             <w:r>
@@ -631,6 +829,12 @@
         <w:tc>
           <w:tcPr>
             <w:tcW w:type="dxa" w:w="2946"/>
+            <w:tcBorders>
+              <w:top w:val="single" w:sz="4" w:space="0" w:color="000000"/>
+              <w:left w:val="single" w:sz="4" w:space="0" w:color="000000"/>
+              <w:bottom w:val="single" w:sz="4" w:space="0" w:color="000000"/>
+              <w:right w:val="single" w:sz="4" w:space="0" w:color="000000"/>
+            </w:tcBorders>
           </w:tcPr>
           <w:p>
             <w:r>
@@ -644,6 +848,12 @@
         <w:tc>
           <w:tcPr>
             <w:tcW w:type="dxa" w:w="2946"/>
+            <w:tcBorders>
+              <w:top w:val="single" w:sz="4" w:space="0" w:color="000000"/>
+              <w:left w:val="single" w:sz="4" w:space="0" w:color="000000"/>
+              <w:bottom w:val="single" w:sz="4" w:space="0" w:color="000000"/>
+              <w:right w:val="single" w:sz="4" w:space="0" w:color="000000"/>
+            </w:tcBorders>
           </w:tcPr>
           <w:p>
             <w:r>
@@ -657,6 +867,12 @@
         <w:tc>
           <w:tcPr>
             <w:tcW w:type="dxa" w:w="2946"/>
+            <w:tcBorders>
+              <w:top w:val="single" w:sz="4" w:space="0" w:color="000000"/>
+              <w:left w:val="single" w:sz="4" w:space="0" w:color="000000"/>
+              <w:bottom w:val="single" w:sz="4" w:space="0" w:color="000000"/>
+              <w:right w:val="single" w:sz="4" w:space="0" w:color="000000"/>
+            </w:tcBorders>
           </w:tcPr>
           <w:p>
             <w:r>
@@ -672,6 +888,12 @@
         <w:tc>
           <w:tcPr>
             <w:tcW w:type="dxa" w:w="2946"/>
+            <w:tcBorders>
+              <w:top w:val="single" w:sz="4" w:space="0" w:color="000000"/>
+              <w:left w:val="single" w:sz="4" w:space="0" w:color="000000"/>
+              <w:bottom w:val="single" w:sz="4" w:space="0" w:color="000000"/>
+              <w:right w:val="single" w:sz="4" w:space="0" w:color="000000"/>
+            </w:tcBorders>
           </w:tcPr>
           <w:p>
             <w:r>
@@ -682,6 +904,12 @@
         <w:tc>
           <w:tcPr>
             <w:tcW w:type="dxa" w:w="2946"/>
+            <w:tcBorders>
+              <w:top w:val="single" w:sz="4" w:space="0" w:color="000000"/>
+              <w:left w:val="single" w:sz="4" w:space="0" w:color="000000"/>
+              <w:bottom w:val="single" w:sz="4" w:space="0" w:color="000000"/>
+              <w:right w:val="single" w:sz="4" w:space="0" w:color="000000"/>
+            </w:tcBorders>
           </w:tcPr>
           <w:p>
             <w:r>
@@ -692,6 +920,12 @@
         <w:tc>
           <w:tcPr>
             <w:tcW w:type="dxa" w:w="2946"/>
+            <w:tcBorders>
+              <w:top w:val="single" w:sz="4" w:space="0" w:color="000000"/>
+              <w:left w:val="single" w:sz="4" w:space="0" w:color="000000"/>
+              <w:bottom w:val="single" w:sz="4" w:space="0" w:color="000000"/>
+              <w:right w:val="single" w:sz="4" w:space="0" w:color="000000"/>
+            </w:tcBorders>
           </w:tcPr>
           <w:p>
             <w:r>
@@ -704,6 +938,12 @@
         <w:tc>
           <w:tcPr>
             <w:tcW w:type="dxa" w:w="2946"/>
+            <w:tcBorders>
+              <w:top w:val="single" w:sz="4" w:space="0" w:color="000000"/>
+              <w:left w:val="single" w:sz="4" w:space="0" w:color="000000"/>
+              <w:bottom w:val="single" w:sz="4" w:space="0" w:color="000000"/>
+              <w:right w:val="single" w:sz="4" w:space="0" w:color="000000"/>
+            </w:tcBorders>
           </w:tcPr>
           <w:p>
             <w:r>
@@ -714,6 +954,12 @@
         <w:tc>
           <w:tcPr>
             <w:tcW w:type="dxa" w:w="2946"/>
+            <w:tcBorders>
+              <w:top w:val="single" w:sz="4" w:space="0" w:color="000000"/>
+              <w:left w:val="single" w:sz="4" w:space="0" w:color="000000"/>
+              <w:bottom w:val="single" w:sz="4" w:space="0" w:color="000000"/>
+              <w:right w:val="single" w:sz="4" w:space="0" w:color="000000"/>
+            </w:tcBorders>
           </w:tcPr>
           <w:p>
             <w:r>
@@ -724,6 +970,12 @@
         <w:tc>
           <w:tcPr>
             <w:tcW w:type="dxa" w:w="2946"/>
+            <w:tcBorders>
+              <w:top w:val="single" w:sz="4" w:space="0" w:color="000000"/>
+              <w:left w:val="single" w:sz="4" w:space="0" w:color="000000"/>
+              <w:bottom w:val="single" w:sz="4" w:space="0" w:color="000000"/>
+              <w:right w:val="single" w:sz="4" w:space="0" w:color="000000"/>
+            </w:tcBorders>
           </w:tcPr>
           <w:p>
             <w:r>
@@ -736,6 +988,12 @@
         <w:tc>
           <w:tcPr>
             <w:tcW w:type="dxa" w:w="2946"/>
+            <w:tcBorders>
+              <w:top w:val="single" w:sz="4" w:space="0" w:color="000000"/>
+              <w:left w:val="single" w:sz="4" w:space="0" w:color="000000"/>
+              <w:bottom w:val="single" w:sz="4" w:space="0" w:color="000000"/>
+              <w:right w:val="single" w:sz="4" w:space="0" w:color="000000"/>
+            </w:tcBorders>
           </w:tcPr>
           <w:p>
             <w:r>
@@ -746,6 +1004,12 @@
         <w:tc>
           <w:tcPr>
             <w:tcW w:type="dxa" w:w="2946"/>
+            <w:tcBorders>
+              <w:top w:val="single" w:sz="4" w:space="0" w:color="000000"/>
+              <w:left w:val="single" w:sz="4" w:space="0" w:color="000000"/>
+              <w:bottom w:val="single" w:sz="4" w:space="0" w:color="000000"/>
+              <w:right w:val="single" w:sz="4" w:space="0" w:color="000000"/>
+            </w:tcBorders>
           </w:tcPr>
           <w:p>
             <w:r>
@@ -756,6 +1020,12 @@
         <w:tc>
           <w:tcPr>
             <w:tcW w:type="dxa" w:w="2946"/>
+            <w:tcBorders>
+              <w:top w:val="single" w:sz="4" w:space="0" w:color="000000"/>
+              <w:left w:val="single" w:sz="4" w:space="0" w:color="000000"/>
+              <w:bottom w:val="single" w:sz="4" w:space="0" w:color="000000"/>
+              <w:right w:val="single" w:sz="4" w:space="0" w:color="000000"/>
+            </w:tcBorders>
           </w:tcPr>
           <w:p>
             <w:r>
@@ -768,6 +1038,12 @@
         <w:tc>
           <w:tcPr>
             <w:tcW w:type="dxa" w:w="2946"/>
+            <w:tcBorders>
+              <w:top w:val="single" w:sz="4" w:space="0" w:color="000000"/>
+              <w:left w:val="single" w:sz="4" w:space="0" w:color="000000"/>
+              <w:bottom w:val="single" w:sz="4" w:space="0" w:color="000000"/>
+              <w:right w:val="single" w:sz="4" w:space="0" w:color="000000"/>
+            </w:tcBorders>
           </w:tcPr>
           <w:p>
             <w:r>
@@ -778,6 +1054,12 @@
         <w:tc>
           <w:tcPr>
             <w:tcW w:type="dxa" w:w="2946"/>
+            <w:tcBorders>
+              <w:top w:val="single" w:sz="4" w:space="0" w:color="000000"/>
+              <w:left w:val="single" w:sz="4" w:space="0" w:color="000000"/>
+              <w:bottom w:val="single" w:sz="4" w:space="0" w:color="000000"/>
+              <w:right w:val="single" w:sz="4" w:space="0" w:color="000000"/>
+            </w:tcBorders>
           </w:tcPr>
           <w:p>
             <w:r>
@@ -788,6 +1070,12 @@
         <w:tc>
           <w:tcPr>
             <w:tcW w:type="dxa" w:w="2946"/>
+            <w:tcBorders>
+              <w:top w:val="single" w:sz="4" w:space="0" w:color="000000"/>
+              <w:left w:val="single" w:sz="4" w:space="0" w:color="000000"/>
+              <w:bottom w:val="single" w:sz="4" w:space="0" w:color="000000"/>
+              <w:right w:val="single" w:sz="4" w:space="0" w:color="000000"/>
+            </w:tcBorders>
           </w:tcPr>
           <w:p>
             <w:r>
@@ -800,6 +1088,12 @@
         <w:tc>
           <w:tcPr>
             <w:tcW w:type="dxa" w:w="2946"/>
+            <w:tcBorders>
+              <w:top w:val="single" w:sz="4" w:space="0" w:color="000000"/>
+              <w:left w:val="single" w:sz="4" w:space="0" w:color="000000"/>
+              <w:bottom w:val="single" w:sz="4" w:space="0" w:color="000000"/>
+              <w:right w:val="single" w:sz="4" w:space="0" w:color="000000"/>
+            </w:tcBorders>
           </w:tcPr>
           <w:p>
             <w:r>
@@ -810,6 +1104,12 @@
         <w:tc>
           <w:tcPr>
             <w:tcW w:type="dxa" w:w="2946"/>
+            <w:tcBorders>
+              <w:top w:val="single" w:sz="4" w:space="0" w:color="000000"/>
+              <w:left w:val="single" w:sz="4" w:space="0" w:color="000000"/>
+              <w:bottom w:val="single" w:sz="4" w:space="0" w:color="000000"/>
+              <w:right w:val="single" w:sz="4" w:space="0" w:color="000000"/>
+            </w:tcBorders>
           </w:tcPr>
           <w:p>
             <w:r>
@@ -820,6 +1120,12 @@
         <w:tc>
           <w:tcPr>
             <w:tcW w:type="dxa" w:w="2946"/>
+            <w:tcBorders>
+              <w:top w:val="single" w:sz="4" w:space="0" w:color="000000"/>
+              <w:left w:val="single" w:sz="4" w:space="0" w:color="000000"/>
+              <w:bottom w:val="single" w:sz="4" w:space="0" w:color="000000"/>
+              <w:right w:val="single" w:sz="4" w:space="0" w:color="000000"/>
+            </w:tcBorders>
           </w:tcPr>
           <w:p>
             <w:r>
@@ -832,6 +1138,12 @@
         <w:tc>
           <w:tcPr>
             <w:tcW w:type="dxa" w:w="2946"/>
+            <w:tcBorders>
+              <w:top w:val="single" w:sz="4" w:space="0" w:color="000000"/>
+              <w:left w:val="single" w:sz="4" w:space="0" w:color="000000"/>
+              <w:bottom w:val="single" w:sz="4" w:space="0" w:color="000000"/>
+              <w:right w:val="single" w:sz="4" w:space="0" w:color="000000"/>
+            </w:tcBorders>
           </w:tcPr>
           <w:p>
             <w:r>
@@ -842,6 +1154,12 @@
         <w:tc>
           <w:tcPr>
             <w:tcW w:type="dxa" w:w="2946"/>
+            <w:tcBorders>
+              <w:top w:val="single" w:sz="4" w:space="0" w:color="000000"/>
+              <w:left w:val="single" w:sz="4" w:space="0" w:color="000000"/>
+              <w:bottom w:val="single" w:sz="4" w:space="0" w:color="000000"/>
+              <w:right w:val="single" w:sz="4" w:space="0" w:color="000000"/>
+            </w:tcBorders>
           </w:tcPr>
           <w:p>
             <w:r>
@@ -852,6 +1170,12 @@
         <w:tc>
           <w:tcPr>
             <w:tcW w:type="dxa" w:w="2946"/>
+            <w:tcBorders>
+              <w:top w:val="single" w:sz="4" w:space="0" w:color="000000"/>
+              <w:left w:val="single" w:sz="4" w:space="0" w:color="000000"/>
+              <w:bottom w:val="single" w:sz="4" w:space="0" w:color="000000"/>
+              <w:right w:val="single" w:sz="4" w:space="0" w:color="000000"/>
+            </w:tcBorders>
           </w:tcPr>
           <w:p>
             <w:r>
@@ -894,6 +1218,12 @@
         <w:tc>
           <w:tcPr>
             <w:tcW w:type="dxa" w:w="2209"/>
+            <w:tcBorders>
+              <w:top w:val="single" w:sz="4" w:space="0" w:color="000000"/>
+              <w:left w:val="single" w:sz="4" w:space="0" w:color="000000"/>
+              <w:bottom w:val="single" w:sz="4" w:space="0" w:color="000000"/>
+              <w:right w:val="single" w:sz="4" w:space="0" w:color="000000"/>
+            </w:tcBorders>
           </w:tcPr>
           <w:p>
             <w:r>
@@ -907,6 +1237,12 @@
         <w:tc>
           <w:tcPr>
             <w:tcW w:type="dxa" w:w="2209"/>
+            <w:tcBorders>
+              <w:top w:val="single" w:sz="4" w:space="0" w:color="000000"/>
+              <w:left w:val="single" w:sz="4" w:space="0" w:color="000000"/>
+              <w:bottom w:val="single" w:sz="4" w:space="0" w:color="000000"/>
+              <w:right w:val="single" w:sz="4" w:space="0" w:color="000000"/>
+            </w:tcBorders>
           </w:tcPr>
           <w:p>
             <w:r>
@@ -920,6 +1256,12 @@
         <w:tc>
           <w:tcPr>
             <w:tcW w:type="dxa" w:w="2209"/>
+            <w:tcBorders>
+              <w:top w:val="single" w:sz="4" w:space="0" w:color="000000"/>
+              <w:left w:val="single" w:sz="4" w:space="0" w:color="000000"/>
+              <w:bottom w:val="single" w:sz="4" w:space="0" w:color="000000"/>
+              <w:right w:val="single" w:sz="4" w:space="0" w:color="000000"/>
+            </w:tcBorders>
           </w:tcPr>
           <w:p>
             <w:r>
@@ -933,6 +1275,12 @@
         <w:tc>
           <w:tcPr>
             <w:tcW w:type="dxa" w:w="2209"/>
+            <w:tcBorders>
+              <w:top w:val="single" w:sz="4" w:space="0" w:color="000000"/>
+              <w:left w:val="single" w:sz="4" w:space="0" w:color="000000"/>
+              <w:bottom w:val="single" w:sz="4" w:space="0" w:color="000000"/>
+              <w:right w:val="single" w:sz="4" w:space="0" w:color="000000"/>
+            </w:tcBorders>
           </w:tcPr>
           <w:p>
             <w:r>
@@ -948,6 +1296,12 @@
         <w:tc>
           <w:tcPr>
             <w:tcW w:type="dxa" w:w="2209"/>
+            <w:tcBorders>
+              <w:top w:val="single" w:sz="4" w:space="0" w:color="000000"/>
+              <w:left w:val="single" w:sz="4" w:space="0" w:color="000000"/>
+              <w:bottom w:val="single" w:sz="4" w:space="0" w:color="000000"/>
+              <w:right w:val="single" w:sz="4" w:space="0" w:color="000000"/>
+            </w:tcBorders>
           </w:tcPr>
           <w:p>
             <w:r>
@@ -958,6 +1312,12 @@
         <w:tc>
           <w:tcPr>
             <w:tcW w:type="dxa" w:w="2209"/>
+            <w:tcBorders>
+              <w:top w:val="single" w:sz="4" w:space="0" w:color="000000"/>
+              <w:left w:val="single" w:sz="4" w:space="0" w:color="000000"/>
+              <w:bottom w:val="single" w:sz="4" w:space="0" w:color="000000"/>
+              <w:right w:val="single" w:sz="4" w:space="0" w:color="000000"/>
+            </w:tcBorders>
           </w:tcPr>
           <w:p>
             <w:r>
@@ -968,6 +1328,12 @@
         <w:tc>
           <w:tcPr>
             <w:tcW w:type="dxa" w:w="2209"/>
+            <w:tcBorders>
+              <w:top w:val="single" w:sz="4" w:space="0" w:color="000000"/>
+              <w:left w:val="single" w:sz="4" w:space="0" w:color="000000"/>
+              <w:bottom w:val="single" w:sz="4" w:space="0" w:color="000000"/>
+              <w:right w:val="single" w:sz="4" w:space="0" w:color="000000"/>
+            </w:tcBorders>
           </w:tcPr>
           <w:p>
             <w:r>
@@ -978,6 +1344,12 @@
         <w:tc>
           <w:tcPr>
             <w:tcW w:type="dxa" w:w="2209"/>
+            <w:tcBorders>
+              <w:top w:val="single" w:sz="4" w:space="0" w:color="000000"/>
+              <w:left w:val="single" w:sz="4" w:space="0" w:color="000000"/>
+              <w:bottom w:val="single" w:sz="4" w:space="0" w:color="000000"/>
+              <w:right w:val="single" w:sz="4" w:space="0" w:color="000000"/>
+            </w:tcBorders>
           </w:tcPr>
           <w:p>
             <w:r>
@@ -990,6 +1362,12 @@
         <w:tc>
           <w:tcPr>
             <w:tcW w:type="dxa" w:w="2209"/>
+            <w:tcBorders>
+              <w:top w:val="single" w:sz="4" w:space="0" w:color="000000"/>
+              <w:left w:val="single" w:sz="4" w:space="0" w:color="000000"/>
+              <w:bottom w:val="single" w:sz="4" w:space="0" w:color="000000"/>
+              <w:right w:val="single" w:sz="4" w:space="0" w:color="000000"/>
+            </w:tcBorders>
           </w:tcPr>
           <w:p>
             <w:r>
@@ -1000,6 +1378,12 @@
         <w:tc>
           <w:tcPr>
             <w:tcW w:type="dxa" w:w="2209"/>
+            <w:tcBorders>
+              <w:top w:val="single" w:sz="4" w:space="0" w:color="000000"/>
+              <w:left w:val="single" w:sz="4" w:space="0" w:color="000000"/>
+              <w:bottom w:val="single" w:sz="4" w:space="0" w:color="000000"/>
+              <w:right w:val="single" w:sz="4" w:space="0" w:color="000000"/>
+            </w:tcBorders>
           </w:tcPr>
           <w:p>
             <w:r>
@@ -1010,6 +1394,12 @@
         <w:tc>
           <w:tcPr>
             <w:tcW w:type="dxa" w:w="2209"/>
+            <w:tcBorders>
+              <w:top w:val="single" w:sz="4" w:space="0" w:color="000000"/>
+              <w:left w:val="single" w:sz="4" w:space="0" w:color="000000"/>
+              <w:bottom w:val="single" w:sz="4" w:space="0" w:color="000000"/>
+              <w:right w:val="single" w:sz="4" w:space="0" w:color="000000"/>
+            </w:tcBorders>
           </w:tcPr>
           <w:p>
             <w:r>
@@ -1020,6 +1410,12 @@
         <w:tc>
           <w:tcPr>
             <w:tcW w:type="dxa" w:w="2209"/>
+            <w:tcBorders>
+              <w:top w:val="single" w:sz="4" w:space="0" w:color="000000"/>
+              <w:left w:val="single" w:sz="4" w:space="0" w:color="000000"/>
+              <w:bottom w:val="single" w:sz="4" w:space="0" w:color="000000"/>
+              <w:right w:val="single" w:sz="4" w:space="0" w:color="000000"/>
+            </w:tcBorders>
           </w:tcPr>
           <w:p>
             <w:r>
@@ -1032,6 +1428,12 @@
         <w:tc>
           <w:tcPr>
             <w:tcW w:type="dxa" w:w="2209"/>
+            <w:tcBorders>
+              <w:top w:val="single" w:sz="4" w:space="0" w:color="000000"/>
+              <w:left w:val="single" w:sz="4" w:space="0" w:color="000000"/>
+              <w:bottom w:val="single" w:sz="4" w:space="0" w:color="000000"/>
+              <w:right w:val="single" w:sz="4" w:space="0" w:color="000000"/>
+            </w:tcBorders>
           </w:tcPr>
           <w:p>
             <w:r>
@@ -1042,6 +1444,12 @@
         <w:tc>
           <w:tcPr>
             <w:tcW w:type="dxa" w:w="2209"/>
+            <w:tcBorders>
+              <w:top w:val="single" w:sz="4" w:space="0" w:color="000000"/>
+              <w:left w:val="single" w:sz="4" w:space="0" w:color="000000"/>
+              <w:bottom w:val="single" w:sz="4" w:space="0" w:color="000000"/>
+              <w:right w:val="single" w:sz="4" w:space="0" w:color="000000"/>
+            </w:tcBorders>
           </w:tcPr>
           <w:p>
             <w:r>
@@ -1052,6 +1460,12 @@
         <w:tc>
           <w:tcPr>
             <w:tcW w:type="dxa" w:w="2209"/>
+            <w:tcBorders>
+              <w:top w:val="single" w:sz="4" w:space="0" w:color="000000"/>
+              <w:left w:val="single" w:sz="4" w:space="0" w:color="000000"/>
+              <w:bottom w:val="single" w:sz="4" w:space="0" w:color="000000"/>
+              <w:right w:val="single" w:sz="4" w:space="0" w:color="000000"/>
+            </w:tcBorders>
           </w:tcPr>
           <w:p>
             <w:r>
@@ -1062,6 +1476,12 @@
         <w:tc>
           <w:tcPr>
             <w:tcW w:type="dxa" w:w="2209"/>
+            <w:tcBorders>
+              <w:top w:val="single" w:sz="4" w:space="0" w:color="000000"/>
+              <w:left w:val="single" w:sz="4" w:space="0" w:color="000000"/>
+              <w:bottom w:val="single" w:sz="4" w:space="0" w:color="000000"/>
+              <w:right w:val="single" w:sz="4" w:space="0" w:color="000000"/>
+            </w:tcBorders>
           </w:tcPr>
           <w:p>
             <w:r>
@@ -1074,6 +1494,12 @@
         <w:tc>
           <w:tcPr>
             <w:tcW w:type="dxa" w:w="2209"/>
+            <w:tcBorders>
+              <w:top w:val="single" w:sz="4" w:space="0" w:color="000000"/>
+              <w:left w:val="single" w:sz="4" w:space="0" w:color="000000"/>
+              <w:bottom w:val="single" w:sz="4" w:space="0" w:color="000000"/>
+              <w:right w:val="single" w:sz="4" w:space="0" w:color="000000"/>
+            </w:tcBorders>
           </w:tcPr>
           <w:p>
             <w:r>
@@ -1084,6 +1510,12 @@
         <w:tc>
           <w:tcPr>
             <w:tcW w:type="dxa" w:w="2209"/>
+            <w:tcBorders>
+              <w:top w:val="single" w:sz="4" w:space="0" w:color="000000"/>
+              <w:left w:val="single" w:sz="4" w:space="0" w:color="000000"/>
+              <w:bottom w:val="single" w:sz="4" w:space="0" w:color="000000"/>
+              <w:right w:val="single" w:sz="4" w:space="0" w:color="000000"/>
+            </w:tcBorders>
           </w:tcPr>
           <w:p>
             <w:r>
@@ -1094,6 +1526,12 @@
         <w:tc>
           <w:tcPr>
             <w:tcW w:type="dxa" w:w="2209"/>
+            <w:tcBorders>
+              <w:top w:val="single" w:sz="4" w:space="0" w:color="000000"/>
+              <w:left w:val="single" w:sz="4" w:space="0" w:color="000000"/>
+              <w:bottom w:val="single" w:sz="4" w:space="0" w:color="000000"/>
+              <w:right w:val="single" w:sz="4" w:space="0" w:color="000000"/>
+            </w:tcBorders>
           </w:tcPr>
           <w:p>
             <w:r>
@@ -1104,6 +1542,12 @@
         <w:tc>
           <w:tcPr>
             <w:tcW w:type="dxa" w:w="2209"/>
+            <w:tcBorders>
+              <w:top w:val="single" w:sz="4" w:space="0" w:color="000000"/>
+              <w:left w:val="single" w:sz="4" w:space="0" w:color="000000"/>
+              <w:bottom w:val="single" w:sz="4" w:space="0" w:color="000000"/>
+              <w:right w:val="single" w:sz="4" w:space="0" w:color="000000"/>
+            </w:tcBorders>
           </w:tcPr>
           <w:p>
             <w:r>
@@ -1116,6 +1560,12 @@
         <w:tc>
           <w:tcPr>
             <w:tcW w:type="dxa" w:w="2209"/>
+            <w:tcBorders>
+              <w:top w:val="single" w:sz="4" w:space="0" w:color="000000"/>
+              <w:left w:val="single" w:sz="4" w:space="0" w:color="000000"/>
+              <w:bottom w:val="single" w:sz="4" w:space="0" w:color="000000"/>
+              <w:right w:val="single" w:sz="4" w:space="0" w:color="000000"/>
+            </w:tcBorders>
           </w:tcPr>
           <w:p>
             <w:r>
@@ -1126,6 +1576,12 @@
         <w:tc>
           <w:tcPr>
             <w:tcW w:type="dxa" w:w="2209"/>
+            <w:tcBorders>
+              <w:top w:val="single" w:sz="4" w:space="0" w:color="000000"/>
+              <w:left w:val="single" w:sz="4" w:space="0" w:color="000000"/>
+              <w:bottom w:val="single" w:sz="4" w:space="0" w:color="000000"/>
+              <w:right w:val="single" w:sz="4" w:space="0" w:color="000000"/>
+            </w:tcBorders>
           </w:tcPr>
           <w:p>
             <w:r>
@@ -1136,6 +1592,12 @@
         <w:tc>
           <w:tcPr>
             <w:tcW w:type="dxa" w:w="2209"/>
+            <w:tcBorders>
+              <w:top w:val="single" w:sz="4" w:space="0" w:color="000000"/>
+              <w:left w:val="single" w:sz="4" w:space="0" w:color="000000"/>
+              <w:bottom w:val="single" w:sz="4" w:space="0" w:color="000000"/>
+              <w:right w:val="single" w:sz="4" w:space="0" w:color="000000"/>
+            </w:tcBorders>
           </w:tcPr>
           <w:p>
             <w:r>
@@ -1146,6 +1608,12 @@
         <w:tc>
           <w:tcPr>
             <w:tcW w:type="dxa" w:w="2209"/>
+            <w:tcBorders>
+              <w:top w:val="single" w:sz="4" w:space="0" w:color="000000"/>
+              <w:left w:val="single" w:sz="4" w:space="0" w:color="000000"/>
+              <w:bottom w:val="single" w:sz="4" w:space="0" w:color="000000"/>
+              <w:right w:val="single" w:sz="4" w:space="0" w:color="000000"/>
+            </w:tcBorders>
           </w:tcPr>
           <w:p>
             <w:r>
@@ -1158,6 +1626,12 @@
         <w:tc>
           <w:tcPr>
             <w:tcW w:type="dxa" w:w="2209"/>
+            <w:tcBorders>
+              <w:top w:val="single" w:sz="4" w:space="0" w:color="000000"/>
+              <w:left w:val="single" w:sz="4" w:space="0" w:color="000000"/>
+              <w:bottom w:val="single" w:sz="4" w:space="0" w:color="000000"/>
+              <w:right w:val="single" w:sz="4" w:space="0" w:color="000000"/>
+            </w:tcBorders>
           </w:tcPr>
           <w:p>
             <w:r>
@@ -1168,6 +1642,12 @@
         <w:tc>
           <w:tcPr>
             <w:tcW w:type="dxa" w:w="2209"/>
+            <w:tcBorders>
+              <w:top w:val="single" w:sz="4" w:space="0" w:color="000000"/>
+              <w:left w:val="single" w:sz="4" w:space="0" w:color="000000"/>
+              <w:bottom w:val="single" w:sz="4" w:space="0" w:color="000000"/>
+              <w:right w:val="single" w:sz="4" w:space="0" w:color="000000"/>
+            </w:tcBorders>
           </w:tcPr>
           <w:p>
             <w:r>
@@ -1178,6 +1658,12 @@
         <w:tc>
           <w:tcPr>
             <w:tcW w:type="dxa" w:w="2209"/>
+            <w:tcBorders>
+              <w:top w:val="single" w:sz="4" w:space="0" w:color="000000"/>
+              <w:left w:val="single" w:sz="4" w:space="0" w:color="000000"/>
+              <w:bottom w:val="single" w:sz="4" w:space="0" w:color="000000"/>
+              <w:right w:val="single" w:sz="4" w:space="0" w:color="000000"/>
+            </w:tcBorders>
           </w:tcPr>
           <w:p>
             <w:r>
@@ -1188,6 +1674,12 @@
         <w:tc>
           <w:tcPr>
             <w:tcW w:type="dxa" w:w="2209"/>
+            <w:tcBorders>
+              <w:top w:val="single" w:sz="4" w:space="0" w:color="000000"/>
+              <w:left w:val="single" w:sz="4" w:space="0" w:color="000000"/>
+              <w:bottom w:val="single" w:sz="4" w:space="0" w:color="000000"/>
+              <w:right w:val="single" w:sz="4" w:space="0" w:color="000000"/>
+            </w:tcBorders>
           </w:tcPr>
           <w:p>
             <w:r>
@@ -1200,6 +1692,12 @@
         <w:tc>
           <w:tcPr>
             <w:tcW w:type="dxa" w:w="2209"/>
+            <w:tcBorders>
+              <w:top w:val="single" w:sz="4" w:space="0" w:color="000000"/>
+              <w:left w:val="single" w:sz="4" w:space="0" w:color="000000"/>
+              <w:bottom w:val="single" w:sz="4" w:space="0" w:color="000000"/>
+              <w:right w:val="single" w:sz="4" w:space="0" w:color="000000"/>
+            </w:tcBorders>
           </w:tcPr>
           <w:p>
             <w:r>
@@ -1210,6 +1708,12 @@
         <w:tc>
           <w:tcPr>
             <w:tcW w:type="dxa" w:w="2209"/>
+            <w:tcBorders>
+              <w:top w:val="single" w:sz="4" w:space="0" w:color="000000"/>
+              <w:left w:val="single" w:sz="4" w:space="0" w:color="000000"/>
+              <w:bottom w:val="single" w:sz="4" w:space="0" w:color="000000"/>
+              <w:right w:val="single" w:sz="4" w:space="0" w:color="000000"/>
+            </w:tcBorders>
           </w:tcPr>
           <w:p>
             <w:r>
@@ -1220,6 +1724,12 @@
         <w:tc>
           <w:tcPr>
             <w:tcW w:type="dxa" w:w="2209"/>
+            <w:tcBorders>
+              <w:top w:val="single" w:sz="4" w:space="0" w:color="000000"/>
+              <w:left w:val="single" w:sz="4" w:space="0" w:color="000000"/>
+              <w:bottom w:val="single" w:sz="4" w:space="0" w:color="000000"/>
+              <w:right w:val="single" w:sz="4" w:space="0" w:color="000000"/>
+            </w:tcBorders>
           </w:tcPr>
           <w:p>
             <w:r>
@@ -1230,6 +1740,12 @@
         <w:tc>
           <w:tcPr>
             <w:tcW w:type="dxa" w:w="2209"/>
+            <w:tcBorders>
+              <w:top w:val="single" w:sz="4" w:space="0" w:color="000000"/>
+              <w:left w:val="single" w:sz="4" w:space="0" w:color="000000"/>
+              <w:bottom w:val="single" w:sz="4" w:space="0" w:color="000000"/>
+              <w:right w:val="single" w:sz="4" w:space="0" w:color="000000"/>
+            </w:tcBorders>
           </w:tcPr>
           <w:p>
             <w:r>
@@ -1296,6 +1812,12 @@
         <w:tc>
           <w:tcPr>
             <w:tcW w:type="dxa" w:w="2946"/>
+            <w:tcBorders>
+              <w:top w:val="single" w:sz="4" w:space="0" w:color="000000"/>
+              <w:left w:val="single" w:sz="4" w:space="0" w:color="000000"/>
+              <w:bottom w:val="single" w:sz="4" w:space="0" w:color="000000"/>
+              <w:right w:val="single" w:sz="4" w:space="0" w:color="000000"/>
+            </w:tcBorders>
           </w:tcPr>
           <w:p>
             <w:r>
@@ -1309,6 +1831,12 @@
         <w:tc>
           <w:tcPr>
             <w:tcW w:type="dxa" w:w="2946"/>
+            <w:tcBorders>
+              <w:top w:val="single" w:sz="4" w:space="0" w:color="000000"/>
+              <w:left w:val="single" w:sz="4" w:space="0" w:color="000000"/>
+              <w:bottom w:val="single" w:sz="4" w:space="0" w:color="000000"/>
+              <w:right w:val="single" w:sz="4" w:space="0" w:color="000000"/>
+            </w:tcBorders>
           </w:tcPr>
           <w:p>
             <w:r>
@@ -1322,6 +1850,12 @@
         <w:tc>
           <w:tcPr>
             <w:tcW w:type="dxa" w:w="2946"/>
+            <w:tcBorders>
+              <w:top w:val="single" w:sz="4" w:space="0" w:color="000000"/>
+              <w:left w:val="single" w:sz="4" w:space="0" w:color="000000"/>
+              <w:bottom w:val="single" w:sz="4" w:space="0" w:color="000000"/>
+              <w:right w:val="single" w:sz="4" w:space="0" w:color="000000"/>
+            </w:tcBorders>
           </w:tcPr>
           <w:p>
             <w:r>
@@ -1337,6 +1871,12 @@
         <w:tc>
           <w:tcPr>
             <w:tcW w:type="dxa" w:w="2946"/>
+            <w:tcBorders>
+              <w:top w:val="single" w:sz="4" w:space="0" w:color="000000"/>
+              <w:left w:val="single" w:sz="4" w:space="0" w:color="000000"/>
+              <w:bottom w:val="single" w:sz="4" w:space="0" w:color="000000"/>
+              <w:right w:val="single" w:sz="4" w:space="0" w:color="000000"/>
+            </w:tcBorders>
           </w:tcPr>
           <w:p>
             <w:r>
@@ -1347,6 +1887,12 @@
         <w:tc>
           <w:tcPr>
             <w:tcW w:type="dxa" w:w="2946"/>
+            <w:tcBorders>
+              <w:top w:val="single" w:sz="4" w:space="0" w:color="000000"/>
+              <w:left w:val="single" w:sz="4" w:space="0" w:color="000000"/>
+              <w:bottom w:val="single" w:sz="4" w:space="0" w:color="000000"/>
+              <w:right w:val="single" w:sz="4" w:space="0" w:color="000000"/>
+            </w:tcBorders>
           </w:tcPr>
           <w:p>
             <w:r>
@@ -1357,6 +1903,12 @@
         <w:tc>
           <w:tcPr>
             <w:tcW w:type="dxa" w:w="2946"/>
+            <w:tcBorders>
+              <w:top w:val="single" w:sz="4" w:space="0" w:color="000000"/>
+              <w:left w:val="single" w:sz="4" w:space="0" w:color="000000"/>
+              <w:bottom w:val="single" w:sz="4" w:space="0" w:color="000000"/>
+              <w:right w:val="single" w:sz="4" w:space="0" w:color="000000"/>
+            </w:tcBorders>
           </w:tcPr>
           <w:p>
             <w:r>
@@ -1369,6 +1921,12 @@
         <w:tc>
           <w:tcPr>
             <w:tcW w:type="dxa" w:w="2946"/>
+            <w:tcBorders>
+              <w:top w:val="single" w:sz="4" w:space="0" w:color="000000"/>
+              <w:left w:val="single" w:sz="4" w:space="0" w:color="000000"/>
+              <w:bottom w:val="single" w:sz="4" w:space="0" w:color="000000"/>
+              <w:right w:val="single" w:sz="4" w:space="0" w:color="000000"/>
+            </w:tcBorders>
           </w:tcPr>
           <w:p>
             <w:r>
@@ -1379,6 +1937,12 @@
         <w:tc>
           <w:tcPr>
             <w:tcW w:type="dxa" w:w="2946"/>
+            <w:tcBorders>
+              <w:top w:val="single" w:sz="4" w:space="0" w:color="000000"/>
+              <w:left w:val="single" w:sz="4" w:space="0" w:color="000000"/>
+              <w:bottom w:val="single" w:sz="4" w:space="0" w:color="000000"/>
+              <w:right w:val="single" w:sz="4" w:space="0" w:color="000000"/>
+            </w:tcBorders>
           </w:tcPr>
           <w:p>
             <w:r>
@@ -1389,6 +1953,12 @@
         <w:tc>
           <w:tcPr>
             <w:tcW w:type="dxa" w:w="2946"/>
+            <w:tcBorders>
+              <w:top w:val="single" w:sz="4" w:space="0" w:color="000000"/>
+              <w:left w:val="single" w:sz="4" w:space="0" w:color="000000"/>
+              <w:bottom w:val="single" w:sz="4" w:space="0" w:color="000000"/>
+              <w:right w:val="single" w:sz="4" w:space="0" w:color="000000"/>
+            </w:tcBorders>
           </w:tcPr>
           <w:p>
             <w:r>
@@ -1401,6 +1971,12 @@
         <w:tc>
           <w:tcPr>
             <w:tcW w:type="dxa" w:w="2946"/>
+            <w:tcBorders>
+              <w:top w:val="single" w:sz="4" w:space="0" w:color="000000"/>
+              <w:left w:val="single" w:sz="4" w:space="0" w:color="000000"/>
+              <w:bottom w:val="single" w:sz="4" w:space="0" w:color="000000"/>
+              <w:right w:val="single" w:sz="4" w:space="0" w:color="000000"/>
+            </w:tcBorders>
           </w:tcPr>
           <w:p>
             <w:r>
@@ -1411,6 +1987,12 @@
         <w:tc>
           <w:tcPr>
             <w:tcW w:type="dxa" w:w="2946"/>
+            <w:tcBorders>
+              <w:top w:val="single" w:sz="4" w:space="0" w:color="000000"/>
+              <w:left w:val="single" w:sz="4" w:space="0" w:color="000000"/>
+              <w:bottom w:val="single" w:sz="4" w:space="0" w:color="000000"/>
+              <w:right w:val="single" w:sz="4" w:space="0" w:color="000000"/>
+            </w:tcBorders>
           </w:tcPr>
           <w:p>
             <w:r>
@@ -1421,6 +2003,12 @@
         <w:tc>
           <w:tcPr>
             <w:tcW w:type="dxa" w:w="2946"/>
+            <w:tcBorders>
+              <w:top w:val="single" w:sz="4" w:space="0" w:color="000000"/>
+              <w:left w:val="single" w:sz="4" w:space="0" w:color="000000"/>
+              <w:bottom w:val="single" w:sz="4" w:space="0" w:color="000000"/>
+              <w:right w:val="single" w:sz="4" w:space="0" w:color="000000"/>
+            </w:tcBorders>
           </w:tcPr>
           <w:p>
             <w:r>
@@ -1433,6 +2021,12 @@
         <w:tc>
           <w:tcPr>
             <w:tcW w:type="dxa" w:w="2946"/>
+            <w:tcBorders>
+              <w:top w:val="single" w:sz="4" w:space="0" w:color="000000"/>
+              <w:left w:val="single" w:sz="4" w:space="0" w:color="000000"/>
+              <w:bottom w:val="single" w:sz="4" w:space="0" w:color="000000"/>
+              <w:right w:val="single" w:sz="4" w:space="0" w:color="000000"/>
+            </w:tcBorders>
           </w:tcPr>
           <w:p>
             <w:r>
@@ -1443,6 +2037,12 @@
         <w:tc>
           <w:tcPr>
             <w:tcW w:type="dxa" w:w="2946"/>
+            <w:tcBorders>
+              <w:top w:val="single" w:sz="4" w:space="0" w:color="000000"/>
+              <w:left w:val="single" w:sz="4" w:space="0" w:color="000000"/>
+              <w:bottom w:val="single" w:sz="4" w:space="0" w:color="000000"/>
+              <w:right w:val="single" w:sz="4" w:space="0" w:color="000000"/>
+            </w:tcBorders>
           </w:tcPr>
           <w:p>
             <w:r>
@@ -1453,6 +2053,12 @@
         <w:tc>
           <w:tcPr>
             <w:tcW w:type="dxa" w:w="2946"/>
+            <w:tcBorders>
+              <w:top w:val="single" w:sz="4" w:space="0" w:color="000000"/>
+              <w:left w:val="single" w:sz="4" w:space="0" w:color="000000"/>
+              <w:bottom w:val="single" w:sz="4" w:space="0" w:color="000000"/>
+              <w:right w:val="single" w:sz="4" w:space="0" w:color="000000"/>
+            </w:tcBorders>
           </w:tcPr>
           <w:p>
             <w:r>
@@ -1465,6 +2071,12 @@
         <w:tc>
           <w:tcPr>
             <w:tcW w:type="dxa" w:w="2946"/>
+            <w:tcBorders>
+              <w:top w:val="single" w:sz="4" w:space="0" w:color="000000"/>
+              <w:left w:val="single" w:sz="4" w:space="0" w:color="000000"/>
+              <w:bottom w:val="single" w:sz="4" w:space="0" w:color="000000"/>
+              <w:right w:val="single" w:sz="4" w:space="0" w:color="000000"/>
+            </w:tcBorders>
           </w:tcPr>
           <w:p>
             <w:r>
@@ -1475,6 +2087,12 @@
         <w:tc>
           <w:tcPr>
             <w:tcW w:type="dxa" w:w="2946"/>
+            <w:tcBorders>
+              <w:top w:val="single" w:sz="4" w:space="0" w:color="000000"/>
+              <w:left w:val="single" w:sz="4" w:space="0" w:color="000000"/>
+              <w:bottom w:val="single" w:sz="4" w:space="0" w:color="000000"/>
+              <w:right w:val="single" w:sz="4" w:space="0" w:color="000000"/>
+            </w:tcBorders>
           </w:tcPr>
           <w:p>
             <w:r>
@@ -1485,6 +2103,12 @@
         <w:tc>
           <w:tcPr>
             <w:tcW w:type="dxa" w:w="2946"/>
+            <w:tcBorders>
+              <w:top w:val="single" w:sz="4" w:space="0" w:color="000000"/>
+              <w:left w:val="single" w:sz="4" w:space="0" w:color="000000"/>
+              <w:bottom w:val="single" w:sz="4" w:space="0" w:color="000000"/>
+              <w:right w:val="single" w:sz="4" w:space="0" w:color="000000"/>
+            </w:tcBorders>
           </w:tcPr>
           <w:p>
             <w:r>
@@ -1497,6 +2121,12 @@
         <w:tc>
           <w:tcPr>
             <w:tcW w:type="dxa" w:w="2946"/>
+            <w:tcBorders>
+              <w:top w:val="single" w:sz="4" w:space="0" w:color="000000"/>
+              <w:left w:val="single" w:sz="4" w:space="0" w:color="000000"/>
+              <w:bottom w:val="single" w:sz="4" w:space="0" w:color="000000"/>
+              <w:right w:val="single" w:sz="4" w:space="0" w:color="000000"/>
+            </w:tcBorders>
           </w:tcPr>
           <w:p>
             <w:r>
@@ -1507,6 +2137,12 @@
         <w:tc>
           <w:tcPr>
             <w:tcW w:type="dxa" w:w="2946"/>
+            <w:tcBorders>
+              <w:top w:val="single" w:sz="4" w:space="0" w:color="000000"/>
+              <w:left w:val="single" w:sz="4" w:space="0" w:color="000000"/>
+              <w:bottom w:val="single" w:sz="4" w:space="0" w:color="000000"/>
+              <w:right w:val="single" w:sz="4" w:space="0" w:color="000000"/>
+            </w:tcBorders>
           </w:tcPr>
           <w:p>
             <w:r>
@@ -1517,6 +2153,12 @@
         <w:tc>
           <w:tcPr>
             <w:tcW w:type="dxa" w:w="2946"/>
+            <w:tcBorders>
+              <w:top w:val="single" w:sz="4" w:space="0" w:color="000000"/>
+              <w:left w:val="single" w:sz="4" w:space="0" w:color="000000"/>
+              <w:bottom w:val="single" w:sz="4" w:space="0" w:color="000000"/>
+              <w:right w:val="single" w:sz="4" w:space="0" w:color="000000"/>
+            </w:tcBorders>
           </w:tcPr>
           <w:p>
             <w:r>
@@ -1529,6 +2171,12 @@
         <w:tc>
           <w:tcPr>
             <w:tcW w:type="dxa" w:w="2946"/>
+            <w:tcBorders>
+              <w:top w:val="single" w:sz="4" w:space="0" w:color="000000"/>
+              <w:left w:val="single" w:sz="4" w:space="0" w:color="000000"/>
+              <w:bottom w:val="single" w:sz="4" w:space="0" w:color="000000"/>
+              <w:right w:val="single" w:sz="4" w:space="0" w:color="000000"/>
+            </w:tcBorders>
           </w:tcPr>
           <w:p>
             <w:r>
@@ -1539,6 +2187,12 @@
         <w:tc>
           <w:tcPr>
             <w:tcW w:type="dxa" w:w="2946"/>
+            <w:tcBorders>
+              <w:top w:val="single" w:sz="4" w:space="0" w:color="000000"/>
+              <w:left w:val="single" w:sz="4" w:space="0" w:color="000000"/>
+              <w:bottom w:val="single" w:sz="4" w:space="0" w:color="000000"/>
+              <w:right w:val="single" w:sz="4" w:space="0" w:color="000000"/>
+            </w:tcBorders>
           </w:tcPr>
           <w:p>
             <w:r>
@@ -1549,6 +2203,12 @@
         <w:tc>
           <w:tcPr>
             <w:tcW w:type="dxa" w:w="2946"/>
+            <w:tcBorders>
+              <w:top w:val="single" w:sz="4" w:space="0" w:color="000000"/>
+              <w:left w:val="single" w:sz="4" w:space="0" w:color="000000"/>
+              <w:bottom w:val="single" w:sz="4" w:space="0" w:color="000000"/>
+              <w:right w:val="single" w:sz="4" w:space="0" w:color="000000"/>
+            </w:tcBorders>
           </w:tcPr>
           <w:p>
             <w:r>
@@ -1561,6 +2221,12 @@
         <w:tc>
           <w:tcPr>
             <w:tcW w:type="dxa" w:w="2946"/>
+            <w:tcBorders>
+              <w:top w:val="single" w:sz="4" w:space="0" w:color="000000"/>
+              <w:left w:val="single" w:sz="4" w:space="0" w:color="000000"/>
+              <w:bottom w:val="single" w:sz="4" w:space="0" w:color="000000"/>
+              <w:right w:val="single" w:sz="4" w:space="0" w:color="000000"/>
+            </w:tcBorders>
           </w:tcPr>
           <w:p>
             <w:r>
@@ -1571,6 +2237,12 @@
         <w:tc>
           <w:tcPr>
             <w:tcW w:type="dxa" w:w="2946"/>
+            <w:tcBorders>
+              <w:top w:val="single" w:sz="4" w:space="0" w:color="000000"/>
+              <w:left w:val="single" w:sz="4" w:space="0" w:color="000000"/>
+              <w:bottom w:val="single" w:sz="4" w:space="0" w:color="000000"/>
+              <w:right w:val="single" w:sz="4" w:space="0" w:color="000000"/>
+            </w:tcBorders>
           </w:tcPr>
           <w:p>
             <w:r>
@@ -1581,6 +2253,12 @@
         <w:tc>
           <w:tcPr>
             <w:tcW w:type="dxa" w:w="2946"/>
+            <w:tcBorders>
+              <w:top w:val="single" w:sz="4" w:space="0" w:color="000000"/>
+              <w:left w:val="single" w:sz="4" w:space="0" w:color="000000"/>
+              <w:bottom w:val="single" w:sz="4" w:space="0" w:color="000000"/>
+              <w:right w:val="single" w:sz="4" w:space="0" w:color="000000"/>
+            </w:tcBorders>
           </w:tcPr>
           <w:p>
             <w:r>
@@ -1593,6 +2271,12 @@
         <w:tc>
           <w:tcPr>
             <w:tcW w:type="dxa" w:w="2946"/>
+            <w:tcBorders>
+              <w:top w:val="single" w:sz="4" w:space="0" w:color="000000"/>
+              <w:left w:val="single" w:sz="4" w:space="0" w:color="000000"/>
+              <w:bottom w:val="single" w:sz="4" w:space="0" w:color="000000"/>
+              <w:right w:val="single" w:sz="4" w:space="0" w:color="000000"/>
+            </w:tcBorders>
           </w:tcPr>
           <w:p>
             <w:r>
@@ -1603,6 +2287,12 @@
         <w:tc>
           <w:tcPr>
             <w:tcW w:type="dxa" w:w="2946"/>
+            <w:tcBorders>
+              <w:top w:val="single" w:sz="4" w:space="0" w:color="000000"/>
+              <w:left w:val="single" w:sz="4" w:space="0" w:color="000000"/>
+              <w:bottom w:val="single" w:sz="4" w:space="0" w:color="000000"/>
+              <w:right w:val="single" w:sz="4" w:space="0" w:color="000000"/>
+            </w:tcBorders>
           </w:tcPr>
           <w:p>
             <w:r>
@@ -1613,6 +2303,12 @@
         <w:tc>
           <w:tcPr>
             <w:tcW w:type="dxa" w:w="2946"/>
+            <w:tcBorders>
+              <w:top w:val="single" w:sz="4" w:space="0" w:color="000000"/>
+              <w:left w:val="single" w:sz="4" w:space="0" w:color="000000"/>
+              <w:bottom w:val="single" w:sz="4" w:space="0" w:color="000000"/>
+              <w:right w:val="single" w:sz="4" w:space="0" w:color="000000"/>
+            </w:tcBorders>
           </w:tcPr>
           <w:p>
             <w:r>
@@ -1625,6 +2321,12 @@
         <w:tc>
           <w:tcPr>
             <w:tcW w:type="dxa" w:w="2946"/>
+            <w:tcBorders>
+              <w:top w:val="single" w:sz="4" w:space="0" w:color="000000"/>
+              <w:left w:val="single" w:sz="4" w:space="0" w:color="000000"/>
+              <w:bottom w:val="single" w:sz="4" w:space="0" w:color="000000"/>
+              <w:right w:val="single" w:sz="4" w:space="0" w:color="000000"/>
+            </w:tcBorders>
           </w:tcPr>
           <w:p>
             <w:r>
@@ -1635,6 +2337,12 @@
         <w:tc>
           <w:tcPr>
             <w:tcW w:type="dxa" w:w="2946"/>
+            <w:tcBorders>
+              <w:top w:val="single" w:sz="4" w:space="0" w:color="000000"/>
+              <w:left w:val="single" w:sz="4" w:space="0" w:color="000000"/>
+              <w:bottom w:val="single" w:sz="4" w:space="0" w:color="000000"/>
+              <w:right w:val="single" w:sz="4" w:space="0" w:color="000000"/>
+            </w:tcBorders>
           </w:tcPr>
           <w:p>
             <w:r>
@@ -1645,6 +2353,12 @@
         <w:tc>
           <w:tcPr>
             <w:tcW w:type="dxa" w:w="2946"/>
+            <w:tcBorders>
+              <w:top w:val="single" w:sz="4" w:space="0" w:color="000000"/>
+              <w:left w:val="single" w:sz="4" w:space="0" w:color="000000"/>
+              <w:bottom w:val="single" w:sz="4" w:space="0" w:color="000000"/>
+              <w:right w:val="single" w:sz="4" w:space="0" w:color="000000"/>
+            </w:tcBorders>
           </w:tcPr>
           <w:p>
             <w:r>
@@ -1657,6 +2371,12 @@
         <w:tc>
           <w:tcPr>
             <w:tcW w:type="dxa" w:w="2946"/>
+            <w:tcBorders>
+              <w:top w:val="single" w:sz="4" w:space="0" w:color="000000"/>
+              <w:left w:val="single" w:sz="4" w:space="0" w:color="000000"/>
+              <w:bottom w:val="single" w:sz="4" w:space="0" w:color="000000"/>
+              <w:right w:val="single" w:sz="4" w:space="0" w:color="000000"/>
+            </w:tcBorders>
           </w:tcPr>
           <w:p>
             <w:r>
@@ -1667,6 +2387,12 @@
         <w:tc>
           <w:tcPr>
             <w:tcW w:type="dxa" w:w="2946"/>
+            <w:tcBorders>
+              <w:top w:val="single" w:sz="4" w:space="0" w:color="000000"/>
+              <w:left w:val="single" w:sz="4" w:space="0" w:color="000000"/>
+              <w:bottom w:val="single" w:sz="4" w:space="0" w:color="000000"/>
+              <w:right w:val="single" w:sz="4" w:space="0" w:color="000000"/>
+            </w:tcBorders>
           </w:tcPr>
           <w:p>
             <w:r>
@@ -1677,6 +2403,12 @@
         <w:tc>
           <w:tcPr>
             <w:tcW w:type="dxa" w:w="2946"/>
+            <w:tcBorders>
+              <w:top w:val="single" w:sz="4" w:space="0" w:color="000000"/>
+              <w:left w:val="single" w:sz="4" w:space="0" w:color="000000"/>
+              <w:bottom w:val="single" w:sz="4" w:space="0" w:color="000000"/>
+              <w:right w:val="single" w:sz="4" w:space="0" w:color="000000"/>
+            </w:tcBorders>
           </w:tcPr>
           <w:p>
             <w:r>
@@ -1689,6 +2421,12 @@
         <w:tc>
           <w:tcPr>
             <w:tcW w:type="dxa" w:w="2946"/>
+            <w:tcBorders>
+              <w:top w:val="single" w:sz="4" w:space="0" w:color="000000"/>
+              <w:left w:val="single" w:sz="4" w:space="0" w:color="000000"/>
+              <w:bottom w:val="single" w:sz="4" w:space="0" w:color="000000"/>
+              <w:right w:val="single" w:sz="4" w:space="0" w:color="000000"/>
+            </w:tcBorders>
           </w:tcPr>
           <w:p>
             <w:r>
@@ -1699,6 +2437,12 @@
         <w:tc>
           <w:tcPr>
             <w:tcW w:type="dxa" w:w="2946"/>
+            <w:tcBorders>
+              <w:top w:val="single" w:sz="4" w:space="0" w:color="000000"/>
+              <w:left w:val="single" w:sz="4" w:space="0" w:color="000000"/>
+              <w:bottom w:val="single" w:sz="4" w:space="0" w:color="000000"/>
+              <w:right w:val="single" w:sz="4" w:space="0" w:color="000000"/>
+            </w:tcBorders>
           </w:tcPr>
           <w:p>
             <w:r>
@@ -1709,6 +2453,12 @@
         <w:tc>
           <w:tcPr>
             <w:tcW w:type="dxa" w:w="2946"/>
+            <w:tcBorders>
+              <w:top w:val="single" w:sz="4" w:space="0" w:color="000000"/>
+              <w:left w:val="single" w:sz="4" w:space="0" w:color="000000"/>
+              <w:bottom w:val="single" w:sz="4" w:space="0" w:color="000000"/>
+              <w:right w:val="single" w:sz="4" w:space="0" w:color="000000"/>
+            </w:tcBorders>
           </w:tcPr>
           <w:p>
             <w:r>
@@ -1721,6 +2471,12 @@
         <w:tc>
           <w:tcPr>
             <w:tcW w:type="dxa" w:w="2946"/>
+            <w:tcBorders>
+              <w:top w:val="single" w:sz="4" w:space="0" w:color="000000"/>
+              <w:left w:val="single" w:sz="4" w:space="0" w:color="000000"/>
+              <w:bottom w:val="single" w:sz="4" w:space="0" w:color="000000"/>
+              <w:right w:val="single" w:sz="4" w:space="0" w:color="000000"/>
+            </w:tcBorders>
           </w:tcPr>
           <w:p>
             <w:r>
@@ -1731,6 +2487,12 @@
         <w:tc>
           <w:tcPr>
             <w:tcW w:type="dxa" w:w="2946"/>
+            <w:tcBorders>
+              <w:top w:val="single" w:sz="4" w:space="0" w:color="000000"/>
+              <w:left w:val="single" w:sz="4" w:space="0" w:color="000000"/>
+              <w:bottom w:val="single" w:sz="4" w:space="0" w:color="000000"/>
+              <w:right w:val="single" w:sz="4" w:space="0" w:color="000000"/>
+            </w:tcBorders>
           </w:tcPr>
           <w:p>
             <w:r>
@@ -1741,6 +2503,12 @@
         <w:tc>
           <w:tcPr>
             <w:tcW w:type="dxa" w:w="2946"/>
+            <w:tcBorders>
+              <w:top w:val="single" w:sz="4" w:space="0" w:color="000000"/>
+              <w:left w:val="single" w:sz="4" w:space="0" w:color="000000"/>
+              <w:bottom w:val="single" w:sz="4" w:space="0" w:color="000000"/>
+              <w:right w:val="single" w:sz="4" w:space="0" w:color="000000"/>
+            </w:tcBorders>
           </w:tcPr>
           <w:p>
             <w:r>
@@ -1753,6 +2521,12 @@
         <w:tc>
           <w:tcPr>
             <w:tcW w:type="dxa" w:w="2946"/>
+            <w:tcBorders>
+              <w:top w:val="single" w:sz="4" w:space="0" w:color="000000"/>
+              <w:left w:val="single" w:sz="4" w:space="0" w:color="000000"/>
+              <w:bottom w:val="single" w:sz="4" w:space="0" w:color="000000"/>
+              <w:right w:val="single" w:sz="4" w:space="0" w:color="000000"/>
+            </w:tcBorders>
           </w:tcPr>
           <w:p>
             <w:r>
@@ -1763,6 +2537,12 @@
         <w:tc>
           <w:tcPr>
             <w:tcW w:type="dxa" w:w="2946"/>
+            <w:tcBorders>
+              <w:top w:val="single" w:sz="4" w:space="0" w:color="000000"/>
+              <w:left w:val="single" w:sz="4" w:space="0" w:color="000000"/>
+              <w:bottom w:val="single" w:sz="4" w:space="0" w:color="000000"/>
+              <w:right w:val="single" w:sz="4" w:space="0" w:color="000000"/>
+            </w:tcBorders>
           </w:tcPr>
           <w:p>
             <w:r>
@@ -1773,6 +2553,12 @@
         <w:tc>
           <w:tcPr>
             <w:tcW w:type="dxa" w:w="2946"/>
+            <w:tcBorders>
+              <w:top w:val="single" w:sz="4" w:space="0" w:color="000000"/>
+              <w:left w:val="single" w:sz="4" w:space="0" w:color="000000"/>
+              <w:bottom w:val="single" w:sz="4" w:space="0" w:color="000000"/>
+              <w:right w:val="single" w:sz="4" w:space="0" w:color="000000"/>
+            </w:tcBorders>
           </w:tcPr>
           <w:p>
             <w:r>
@@ -1807,6 +2593,12 @@
         <w:tc>
           <w:tcPr>
             <w:tcW w:type="dxa" w:w="2209"/>
+            <w:tcBorders>
+              <w:top w:val="single" w:sz="4" w:space="0" w:color="000000"/>
+              <w:left w:val="single" w:sz="4" w:space="0" w:color="000000"/>
+              <w:bottom w:val="single" w:sz="4" w:space="0" w:color="000000"/>
+              <w:right w:val="single" w:sz="4" w:space="0" w:color="000000"/>
+            </w:tcBorders>
           </w:tcPr>
           <w:p>
             <w:r>
@@ -1820,6 +2612,12 @@
         <w:tc>
           <w:tcPr>
             <w:tcW w:type="dxa" w:w="2209"/>
+            <w:tcBorders>
+              <w:top w:val="single" w:sz="4" w:space="0" w:color="000000"/>
+              <w:left w:val="single" w:sz="4" w:space="0" w:color="000000"/>
+              <w:bottom w:val="single" w:sz="4" w:space="0" w:color="000000"/>
+              <w:right w:val="single" w:sz="4" w:space="0" w:color="000000"/>
+            </w:tcBorders>
           </w:tcPr>
           <w:p>
             <w:r>
@@ -1833,6 +2631,12 @@
         <w:tc>
           <w:tcPr>
             <w:tcW w:type="dxa" w:w="2209"/>
+            <w:tcBorders>
+              <w:top w:val="single" w:sz="4" w:space="0" w:color="000000"/>
+              <w:left w:val="single" w:sz="4" w:space="0" w:color="000000"/>
+              <w:bottom w:val="single" w:sz="4" w:space="0" w:color="000000"/>
+              <w:right w:val="single" w:sz="4" w:space="0" w:color="000000"/>
+            </w:tcBorders>
           </w:tcPr>
           <w:p>
             <w:r>
@@ -1846,6 +2650,12 @@
         <w:tc>
           <w:tcPr>
             <w:tcW w:type="dxa" w:w="2209"/>
+            <w:tcBorders>
+              <w:top w:val="single" w:sz="4" w:space="0" w:color="000000"/>
+              <w:left w:val="single" w:sz="4" w:space="0" w:color="000000"/>
+              <w:bottom w:val="single" w:sz="4" w:space="0" w:color="000000"/>
+              <w:right w:val="single" w:sz="4" w:space="0" w:color="000000"/>
+            </w:tcBorders>
           </w:tcPr>
           <w:p>
             <w:r>
@@ -1861,6 +2671,12 @@
         <w:tc>
           <w:tcPr>
             <w:tcW w:type="dxa" w:w="2209"/>
+            <w:tcBorders>
+              <w:top w:val="single" w:sz="4" w:space="0" w:color="000000"/>
+              <w:left w:val="single" w:sz="4" w:space="0" w:color="000000"/>
+              <w:bottom w:val="single" w:sz="4" w:space="0" w:color="000000"/>
+              <w:right w:val="single" w:sz="4" w:space="0" w:color="000000"/>
+            </w:tcBorders>
           </w:tcPr>
           <w:p>
             <w:r>
@@ -1871,6 +2687,12 @@
         <w:tc>
           <w:tcPr>
             <w:tcW w:type="dxa" w:w="2209"/>
+            <w:tcBorders>
+              <w:top w:val="single" w:sz="4" w:space="0" w:color="000000"/>
+              <w:left w:val="single" w:sz="4" w:space="0" w:color="000000"/>
+              <w:bottom w:val="single" w:sz="4" w:space="0" w:color="000000"/>
+              <w:right w:val="single" w:sz="4" w:space="0" w:color="000000"/>
+            </w:tcBorders>
           </w:tcPr>
           <w:p>
             <w:r>
@@ -1881,6 +2703,12 @@
         <w:tc>
           <w:tcPr>
             <w:tcW w:type="dxa" w:w="2209"/>
+            <w:tcBorders>
+              <w:top w:val="single" w:sz="4" w:space="0" w:color="000000"/>
+              <w:left w:val="single" w:sz="4" w:space="0" w:color="000000"/>
+              <w:bottom w:val="single" w:sz="4" w:space="0" w:color="000000"/>
+              <w:right w:val="single" w:sz="4" w:space="0" w:color="000000"/>
+            </w:tcBorders>
           </w:tcPr>
           <w:p>
             <w:r>
@@ -1891,6 +2719,12 @@
         <w:tc>
           <w:tcPr>
             <w:tcW w:type="dxa" w:w="2209"/>
+            <w:tcBorders>
+              <w:top w:val="single" w:sz="4" w:space="0" w:color="000000"/>
+              <w:left w:val="single" w:sz="4" w:space="0" w:color="000000"/>
+              <w:bottom w:val="single" w:sz="4" w:space="0" w:color="000000"/>
+              <w:right w:val="single" w:sz="4" w:space="0" w:color="000000"/>
+            </w:tcBorders>
           </w:tcPr>
           <w:p>
             <w:r>
@@ -1903,6 +2737,12 @@
         <w:tc>
           <w:tcPr>
             <w:tcW w:type="dxa" w:w="2209"/>
+            <w:tcBorders>
+              <w:top w:val="single" w:sz="4" w:space="0" w:color="000000"/>
+              <w:left w:val="single" w:sz="4" w:space="0" w:color="000000"/>
+              <w:bottom w:val="single" w:sz="4" w:space="0" w:color="000000"/>
+              <w:right w:val="single" w:sz="4" w:space="0" w:color="000000"/>
+            </w:tcBorders>
           </w:tcPr>
           <w:p>
             <w:r>
@@ -1913,6 +2753,12 @@
         <w:tc>
           <w:tcPr>
             <w:tcW w:type="dxa" w:w="2209"/>
+            <w:tcBorders>
+              <w:top w:val="single" w:sz="4" w:space="0" w:color="000000"/>
+              <w:left w:val="single" w:sz="4" w:space="0" w:color="000000"/>
+              <w:bottom w:val="single" w:sz="4" w:space="0" w:color="000000"/>
+              <w:right w:val="single" w:sz="4" w:space="0" w:color="000000"/>
+            </w:tcBorders>
           </w:tcPr>
           <w:p>
             <w:r>
@@ -1923,6 +2769,12 @@
         <w:tc>
           <w:tcPr>
             <w:tcW w:type="dxa" w:w="2209"/>
+            <w:tcBorders>
+              <w:top w:val="single" w:sz="4" w:space="0" w:color="000000"/>
+              <w:left w:val="single" w:sz="4" w:space="0" w:color="000000"/>
+              <w:bottom w:val="single" w:sz="4" w:space="0" w:color="000000"/>
+              <w:right w:val="single" w:sz="4" w:space="0" w:color="000000"/>
+            </w:tcBorders>
           </w:tcPr>
           <w:p>
             <w:r>
@@ -1933,6 +2785,12 @@
         <w:tc>
           <w:tcPr>
             <w:tcW w:type="dxa" w:w="2209"/>
+            <w:tcBorders>
+              <w:top w:val="single" w:sz="4" w:space="0" w:color="000000"/>
+              <w:left w:val="single" w:sz="4" w:space="0" w:color="000000"/>
+              <w:bottom w:val="single" w:sz="4" w:space="0" w:color="000000"/>
+              <w:right w:val="single" w:sz="4" w:space="0" w:color="000000"/>
+            </w:tcBorders>
           </w:tcPr>
           <w:p>
             <w:r>
@@ -1945,6 +2803,12 @@
         <w:tc>
           <w:tcPr>
             <w:tcW w:type="dxa" w:w="2209"/>
+            <w:tcBorders>
+              <w:top w:val="single" w:sz="4" w:space="0" w:color="000000"/>
+              <w:left w:val="single" w:sz="4" w:space="0" w:color="000000"/>
+              <w:bottom w:val="single" w:sz="4" w:space="0" w:color="000000"/>
+              <w:right w:val="single" w:sz="4" w:space="0" w:color="000000"/>
+            </w:tcBorders>
           </w:tcPr>
           <w:p>
             <w:r>
@@ -1955,6 +2819,12 @@
         <w:tc>
           <w:tcPr>
             <w:tcW w:type="dxa" w:w="2209"/>
+            <w:tcBorders>
+              <w:top w:val="single" w:sz="4" w:space="0" w:color="000000"/>
+              <w:left w:val="single" w:sz="4" w:space="0" w:color="000000"/>
+              <w:bottom w:val="single" w:sz="4" w:space="0" w:color="000000"/>
+              <w:right w:val="single" w:sz="4" w:space="0" w:color="000000"/>
+            </w:tcBorders>
           </w:tcPr>
           <w:p>
             <w:r>
@@ -1965,6 +2835,12 @@
         <w:tc>
           <w:tcPr>
             <w:tcW w:type="dxa" w:w="2209"/>
+            <w:tcBorders>
+              <w:top w:val="single" w:sz="4" w:space="0" w:color="000000"/>
+              <w:left w:val="single" w:sz="4" w:space="0" w:color="000000"/>
+              <w:bottom w:val="single" w:sz="4" w:space="0" w:color="000000"/>
+              <w:right w:val="single" w:sz="4" w:space="0" w:color="000000"/>
+            </w:tcBorders>
           </w:tcPr>
           <w:p>
             <w:r>
@@ -1975,6 +2851,12 @@
         <w:tc>
           <w:tcPr>
             <w:tcW w:type="dxa" w:w="2209"/>
+            <w:tcBorders>
+              <w:top w:val="single" w:sz="4" w:space="0" w:color="000000"/>
+              <w:left w:val="single" w:sz="4" w:space="0" w:color="000000"/>
+              <w:bottom w:val="single" w:sz="4" w:space="0" w:color="000000"/>
+              <w:right w:val="single" w:sz="4" w:space="0" w:color="000000"/>
+            </w:tcBorders>
           </w:tcPr>
           <w:p>
             <w:r>
@@ -1987,6 +2869,12 @@
         <w:tc>
           <w:tcPr>
             <w:tcW w:type="dxa" w:w="2209"/>
+            <w:tcBorders>
+              <w:top w:val="single" w:sz="4" w:space="0" w:color="000000"/>
+              <w:left w:val="single" w:sz="4" w:space="0" w:color="000000"/>
+              <w:bottom w:val="single" w:sz="4" w:space="0" w:color="000000"/>
+              <w:right w:val="single" w:sz="4" w:space="0" w:color="000000"/>
+            </w:tcBorders>
           </w:tcPr>
           <w:p>
             <w:r>
@@ -1997,6 +2885,12 @@
         <w:tc>
           <w:tcPr>
             <w:tcW w:type="dxa" w:w="2209"/>
+            <w:tcBorders>
+              <w:top w:val="single" w:sz="4" w:space="0" w:color="000000"/>
+              <w:left w:val="single" w:sz="4" w:space="0" w:color="000000"/>
+              <w:bottom w:val="single" w:sz="4" w:space="0" w:color="000000"/>
+              <w:right w:val="single" w:sz="4" w:space="0" w:color="000000"/>
+            </w:tcBorders>
           </w:tcPr>
           <w:p>
             <w:r>
@@ -2007,6 +2901,12 @@
         <w:tc>
           <w:tcPr>
             <w:tcW w:type="dxa" w:w="2209"/>
+            <w:tcBorders>
+              <w:top w:val="single" w:sz="4" w:space="0" w:color="000000"/>
+              <w:left w:val="single" w:sz="4" w:space="0" w:color="000000"/>
+              <w:bottom w:val="single" w:sz="4" w:space="0" w:color="000000"/>
+              <w:right w:val="single" w:sz="4" w:space="0" w:color="000000"/>
+            </w:tcBorders>
           </w:tcPr>
           <w:p>
             <w:r>
@@ -2017,6 +2917,12 @@
         <w:tc>
           <w:tcPr>
             <w:tcW w:type="dxa" w:w="2209"/>
+            <w:tcBorders>
+              <w:top w:val="single" w:sz="4" w:space="0" w:color="000000"/>
+              <w:left w:val="single" w:sz="4" w:space="0" w:color="000000"/>
+              <w:bottom w:val="single" w:sz="4" w:space="0" w:color="000000"/>
+              <w:right w:val="single" w:sz="4" w:space="0" w:color="000000"/>
+            </w:tcBorders>
           </w:tcPr>
           <w:p>
             <w:r>
@@ -2029,6 +2935,12 @@
         <w:tc>
           <w:tcPr>
             <w:tcW w:type="dxa" w:w="2209"/>
+            <w:tcBorders>
+              <w:top w:val="single" w:sz="4" w:space="0" w:color="000000"/>
+              <w:left w:val="single" w:sz="4" w:space="0" w:color="000000"/>
+              <w:bottom w:val="single" w:sz="4" w:space="0" w:color="000000"/>
+              <w:right w:val="single" w:sz="4" w:space="0" w:color="000000"/>
+            </w:tcBorders>
           </w:tcPr>
           <w:p>
             <w:r>
@@ -2039,6 +2951,12 @@
         <w:tc>
           <w:tcPr>
             <w:tcW w:type="dxa" w:w="2209"/>
+            <w:tcBorders>
+              <w:top w:val="single" w:sz="4" w:space="0" w:color="000000"/>
+              <w:left w:val="single" w:sz="4" w:space="0" w:color="000000"/>
+              <w:bottom w:val="single" w:sz="4" w:space="0" w:color="000000"/>
+              <w:right w:val="single" w:sz="4" w:space="0" w:color="000000"/>
+            </w:tcBorders>
           </w:tcPr>
           <w:p>
             <w:r>
@@ -2049,6 +2967,12 @@
         <w:tc>
           <w:tcPr>
             <w:tcW w:type="dxa" w:w="2209"/>
+            <w:tcBorders>
+              <w:top w:val="single" w:sz="4" w:space="0" w:color="000000"/>
+              <w:left w:val="single" w:sz="4" w:space="0" w:color="000000"/>
+              <w:bottom w:val="single" w:sz="4" w:space="0" w:color="000000"/>
+              <w:right w:val="single" w:sz="4" w:space="0" w:color="000000"/>
+            </w:tcBorders>
           </w:tcPr>
           <w:p>
             <w:r>
@@ -2059,6 +2983,12 @@
         <w:tc>
           <w:tcPr>
             <w:tcW w:type="dxa" w:w="2209"/>
+            <w:tcBorders>
+              <w:top w:val="single" w:sz="4" w:space="0" w:color="000000"/>
+              <w:left w:val="single" w:sz="4" w:space="0" w:color="000000"/>
+              <w:bottom w:val="single" w:sz="4" w:space="0" w:color="000000"/>
+              <w:right w:val="single" w:sz="4" w:space="0" w:color="000000"/>
+            </w:tcBorders>
           </w:tcPr>
           <w:p>
             <w:r>
@@ -2071,6 +3001,12 @@
         <w:tc>
           <w:tcPr>
             <w:tcW w:type="dxa" w:w="2209"/>
+            <w:tcBorders>
+              <w:top w:val="single" w:sz="4" w:space="0" w:color="000000"/>
+              <w:left w:val="single" w:sz="4" w:space="0" w:color="000000"/>
+              <w:bottom w:val="single" w:sz="4" w:space="0" w:color="000000"/>
+              <w:right w:val="single" w:sz="4" w:space="0" w:color="000000"/>
+            </w:tcBorders>
           </w:tcPr>
           <w:p>
             <w:r>
@@ -2081,6 +3017,12 @@
         <w:tc>
           <w:tcPr>
             <w:tcW w:type="dxa" w:w="2209"/>
+            <w:tcBorders>
+              <w:top w:val="single" w:sz="4" w:space="0" w:color="000000"/>
+              <w:left w:val="single" w:sz="4" w:space="0" w:color="000000"/>
+              <w:bottom w:val="single" w:sz="4" w:space="0" w:color="000000"/>
+              <w:right w:val="single" w:sz="4" w:space="0" w:color="000000"/>
+            </w:tcBorders>
           </w:tcPr>
           <w:p>
             <w:r>
@@ -2091,6 +3033,12 @@
         <w:tc>
           <w:tcPr>
             <w:tcW w:type="dxa" w:w="2209"/>
+            <w:tcBorders>
+              <w:top w:val="single" w:sz="4" w:space="0" w:color="000000"/>
+              <w:left w:val="single" w:sz="4" w:space="0" w:color="000000"/>
+              <w:bottom w:val="single" w:sz="4" w:space="0" w:color="000000"/>
+              <w:right w:val="single" w:sz="4" w:space="0" w:color="000000"/>
+            </w:tcBorders>
           </w:tcPr>
           <w:p>
             <w:r>
@@ -2101,6 +3049,12 @@
         <w:tc>
           <w:tcPr>
             <w:tcW w:type="dxa" w:w="2209"/>
+            <w:tcBorders>
+              <w:top w:val="single" w:sz="4" w:space="0" w:color="000000"/>
+              <w:left w:val="single" w:sz="4" w:space="0" w:color="000000"/>
+              <w:bottom w:val="single" w:sz="4" w:space="0" w:color="000000"/>
+              <w:right w:val="single" w:sz="4" w:space="0" w:color="000000"/>
+            </w:tcBorders>
           </w:tcPr>
           <w:p>
             <w:r>
@@ -2135,6 +3089,12 @@
         <w:tc>
           <w:tcPr>
             <w:tcW w:type="dxa" w:w="2209"/>
+            <w:tcBorders>
+              <w:top w:val="single" w:sz="4" w:space="0" w:color="000000"/>
+              <w:left w:val="single" w:sz="4" w:space="0" w:color="000000"/>
+              <w:bottom w:val="single" w:sz="4" w:space="0" w:color="000000"/>
+              <w:right w:val="single" w:sz="4" w:space="0" w:color="000000"/>
+            </w:tcBorders>
           </w:tcPr>
           <w:p>
             <w:r>
@@ -2148,6 +3108,12 @@
         <w:tc>
           <w:tcPr>
             <w:tcW w:type="dxa" w:w="2209"/>
+            <w:tcBorders>
+              <w:top w:val="single" w:sz="4" w:space="0" w:color="000000"/>
+              <w:left w:val="single" w:sz="4" w:space="0" w:color="000000"/>
+              <w:bottom w:val="single" w:sz="4" w:space="0" w:color="000000"/>
+              <w:right w:val="single" w:sz="4" w:space="0" w:color="000000"/>
+            </w:tcBorders>
           </w:tcPr>
           <w:p>
             <w:r>
@@ -2161,6 +3127,12 @@
         <w:tc>
           <w:tcPr>
             <w:tcW w:type="dxa" w:w="2209"/>
+            <w:tcBorders>
+              <w:top w:val="single" w:sz="4" w:space="0" w:color="000000"/>
+              <w:left w:val="single" w:sz="4" w:space="0" w:color="000000"/>
+              <w:bottom w:val="single" w:sz="4" w:space="0" w:color="000000"/>
+              <w:right w:val="single" w:sz="4" w:space="0" w:color="000000"/>
+            </w:tcBorders>
           </w:tcPr>
           <w:p>
             <w:r>
@@ -2174,6 +3146,12 @@
         <w:tc>
           <w:tcPr>
             <w:tcW w:type="dxa" w:w="2209"/>
+            <w:tcBorders>
+              <w:top w:val="single" w:sz="4" w:space="0" w:color="000000"/>
+              <w:left w:val="single" w:sz="4" w:space="0" w:color="000000"/>
+              <w:bottom w:val="single" w:sz="4" w:space="0" w:color="000000"/>
+              <w:right w:val="single" w:sz="4" w:space="0" w:color="000000"/>
+            </w:tcBorders>
           </w:tcPr>
           <w:p>
             <w:r>
@@ -2189,6 +3167,12 @@
         <w:tc>
           <w:tcPr>
             <w:tcW w:type="dxa" w:w="2209"/>
+            <w:tcBorders>
+              <w:top w:val="single" w:sz="4" w:space="0" w:color="000000"/>
+              <w:left w:val="single" w:sz="4" w:space="0" w:color="000000"/>
+              <w:bottom w:val="single" w:sz="4" w:space="0" w:color="000000"/>
+              <w:right w:val="single" w:sz="4" w:space="0" w:color="000000"/>
+            </w:tcBorders>
           </w:tcPr>
           <w:p>
             <w:r>
@@ -2199,6 +3183,12 @@
         <w:tc>
           <w:tcPr>
             <w:tcW w:type="dxa" w:w="2209"/>
+            <w:tcBorders>
+              <w:top w:val="single" w:sz="4" w:space="0" w:color="000000"/>
+              <w:left w:val="single" w:sz="4" w:space="0" w:color="000000"/>
+              <w:bottom w:val="single" w:sz="4" w:space="0" w:color="000000"/>
+              <w:right w:val="single" w:sz="4" w:space="0" w:color="000000"/>
+            </w:tcBorders>
           </w:tcPr>
           <w:p>
             <w:r>
@@ -2209,6 +3199,12 @@
         <w:tc>
           <w:tcPr>
             <w:tcW w:type="dxa" w:w="2209"/>
+            <w:tcBorders>
+              <w:top w:val="single" w:sz="4" w:space="0" w:color="000000"/>
+              <w:left w:val="single" w:sz="4" w:space="0" w:color="000000"/>
+              <w:bottom w:val="single" w:sz="4" w:space="0" w:color="000000"/>
+              <w:right w:val="single" w:sz="4" w:space="0" w:color="000000"/>
+            </w:tcBorders>
           </w:tcPr>
           <w:p>
             <w:r>
@@ -2219,6 +3215,12 @@
         <w:tc>
           <w:tcPr>
             <w:tcW w:type="dxa" w:w="2209"/>
+            <w:tcBorders>
+              <w:top w:val="single" w:sz="4" w:space="0" w:color="000000"/>
+              <w:left w:val="single" w:sz="4" w:space="0" w:color="000000"/>
+              <w:bottom w:val="single" w:sz="4" w:space="0" w:color="000000"/>
+              <w:right w:val="single" w:sz="4" w:space="0" w:color="000000"/>
+            </w:tcBorders>
           </w:tcPr>
           <w:p>
             <w:r>
@@ -2231,6 +3233,12 @@
         <w:tc>
           <w:tcPr>
             <w:tcW w:type="dxa" w:w="2209"/>
+            <w:tcBorders>
+              <w:top w:val="single" w:sz="4" w:space="0" w:color="000000"/>
+              <w:left w:val="single" w:sz="4" w:space="0" w:color="000000"/>
+              <w:bottom w:val="single" w:sz="4" w:space="0" w:color="000000"/>
+              <w:right w:val="single" w:sz="4" w:space="0" w:color="000000"/>
+            </w:tcBorders>
           </w:tcPr>
           <w:p>
             <w:r>
@@ -2241,6 +3249,12 @@
         <w:tc>
           <w:tcPr>
             <w:tcW w:type="dxa" w:w="2209"/>
+            <w:tcBorders>
+              <w:top w:val="single" w:sz="4" w:space="0" w:color="000000"/>
+              <w:left w:val="single" w:sz="4" w:space="0" w:color="000000"/>
+              <w:bottom w:val="single" w:sz="4" w:space="0" w:color="000000"/>
+              <w:right w:val="single" w:sz="4" w:space="0" w:color="000000"/>
+            </w:tcBorders>
           </w:tcPr>
           <w:p>
             <w:r>
@@ -2251,6 +3265,12 @@
         <w:tc>
           <w:tcPr>
             <w:tcW w:type="dxa" w:w="2209"/>
+            <w:tcBorders>
+              <w:top w:val="single" w:sz="4" w:space="0" w:color="000000"/>
+              <w:left w:val="single" w:sz="4" w:space="0" w:color="000000"/>
+              <w:bottom w:val="single" w:sz="4" w:space="0" w:color="000000"/>
+              <w:right w:val="single" w:sz="4" w:space="0" w:color="000000"/>
+            </w:tcBorders>
           </w:tcPr>
           <w:p>
             <w:r>
@@ -2261,6 +3281,12 @@
         <w:tc>
           <w:tcPr>
             <w:tcW w:type="dxa" w:w="2209"/>
+            <w:tcBorders>
+              <w:top w:val="single" w:sz="4" w:space="0" w:color="000000"/>
+              <w:left w:val="single" w:sz="4" w:space="0" w:color="000000"/>
+              <w:bottom w:val="single" w:sz="4" w:space="0" w:color="000000"/>
+              <w:right w:val="single" w:sz="4" w:space="0" w:color="000000"/>
+            </w:tcBorders>
           </w:tcPr>
           <w:p>
             <w:r>
@@ -2273,6 +3299,12 @@
         <w:tc>
           <w:tcPr>
             <w:tcW w:type="dxa" w:w="2209"/>
+            <w:tcBorders>
+              <w:top w:val="single" w:sz="4" w:space="0" w:color="000000"/>
+              <w:left w:val="single" w:sz="4" w:space="0" w:color="000000"/>
+              <w:bottom w:val="single" w:sz="4" w:space="0" w:color="000000"/>
+              <w:right w:val="single" w:sz="4" w:space="0" w:color="000000"/>
+            </w:tcBorders>
           </w:tcPr>
           <w:p>
             <w:r>
@@ -2283,6 +3315,12 @@
         <w:tc>
           <w:tcPr>
             <w:tcW w:type="dxa" w:w="2209"/>
+            <w:tcBorders>
+              <w:top w:val="single" w:sz="4" w:space="0" w:color="000000"/>
+              <w:left w:val="single" w:sz="4" w:space="0" w:color="000000"/>
+              <w:bottom w:val="single" w:sz="4" w:space="0" w:color="000000"/>
+              <w:right w:val="single" w:sz="4" w:space="0" w:color="000000"/>
+            </w:tcBorders>
           </w:tcPr>
           <w:p>
             <w:r>
@@ -2293,6 +3331,12 @@
         <w:tc>
           <w:tcPr>
             <w:tcW w:type="dxa" w:w="2209"/>
+            <w:tcBorders>
+              <w:top w:val="single" w:sz="4" w:space="0" w:color="000000"/>
+              <w:left w:val="single" w:sz="4" w:space="0" w:color="000000"/>
+              <w:bottom w:val="single" w:sz="4" w:space="0" w:color="000000"/>
+              <w:right w:val="single" w:sz="4" w:space="0" w:color="000000"/>
+            </w:tcBorders>
           </w:tcPr>
           <w:p>
             <w:r>
@@ -2303,6 +3347,12 @@
         <w:tc>
           <w:tcPr>
             <w:tcW w:type="dxa" w:w="2209"/>
+            <w:tcBorders>
+              <w:top w:val="single" w:sz="4" w:space="0" w:color="000000"/>
+              <w:left w:val="single" w:sz="4" w:space="0" w:color="000000"/>
+              <w:bottom w:val="single" w:sz="4" w:space="0" w:color="000000"/>
+              <w:right w:val="single" w:sz="4" w:space="0" w:color="000000"/>
+            </w:tcBorders>
           </w:tcPr>
           <w:p>
             <w:r>
@@ -2315,6 +3365,12 @@
         <w:tc>
           <w:tcPr>
             <w:tcW w:type="dxa" w:w="2209"/>
+            <w:tcBorders>
+              <w:top w:val="single" w:sz="4" w:space="0" w:color="000000"/>
+              <w:left w:val="single" w:sz="4" w:space="0" w:color="000000"/>
+              <w:bottom w:val="single" w:sz="4" w:space="0" w:color="000000"/>
+              <w:right w:val="single" w:sz="4" w:space="0" w:color="000000"/>
+            </w:tcBorders>
           </w:tcPr>
           <w:p>
             <w:r>
@@ -2325,6 +3381,12 @@
         <w:tc>
           <w:tcPr>
             <w:tcW w:type="dxa" w:w="2209"/>
+            <w:tcBorders>
+              <w:top w:val="single" w:sz="4" w:space="0" w:color="000000"/>
+              <w:left w:val="single" w:sz="4" w:space="0" w:color="000000"/>
+              <w:bottom w:val="single" w:sz="4" w:space="0" w:color="000000"/>
+              <w:right w:val="single" w:sz="4" w:space="0" w:color="000000"/>
+            </w:tcBorders>
           </w:tcPr>
           <w:p>
             <w:r>
@@ -2335,6 +3397,12 @@
         <w:tc>
           <w:tcPr>
             <w:tcW w:type="dxa" w:w="2209"/>
+            <w:tcBorders>
+              <w:top w:val="single" w:sz="4" w:space="0" w:color="000000"/>
+              <w:left w:val="single" w:sz="4" w:space="0" w:color="000000"/>
+              <w:bottom w:val="single" w:sz="4" w:space="0" w:color="000000"/>
+              <w:right w:val="single" w:sz="4" w:space="0" w:color="000000"/>
+            </w:tcBorders>
           </w:tcPr>
           <w:p>
             <w:r>
@@ -2345,6 +3413,12 @@
         <w:tc>
           <w:tcPr>
             <w:tcW w:type="dxa" w:w="2209"/>
+            <w:tcBorders>
+              <w:top w:val="single" w:sz="4" w:space="0" w:color="000000"/>
+              <w:left w:val="single" w:sz="4" w:space="0" w:color="000000"/>
+              <w:bottom w:val="single" w:sz="4" w:space="0" w:color="000000"/>
+              <w:right w:val="single" w:sz="4" w:space="0" w:color="000000"/>
+            </w:tcBorders>
           </w:tcPr>
           <w:p>
             <w:r>
@@ -2357,6 +3431,12 @@
         <w:tc>
           <w:tcPr>
             <w:tcW w:type="dxa" w:w="2209"/>
+            <w:tcBorders>
+              <w:top w:val="single" w:sz="4" w:space="0" w:color="000000"/>
+              <w:left w:val="single" w:sz="4" w:space="0" w:color="000000"/>
+              <w:bottom w:val="single" w:sz="4" w:space="0" w:color="000000"/>
+              <w:right w:val="single" w:sz="4" w:space="0" w:color="000000"/>
+            </w:tcBorders>
           </w:tcPr>
           <w:p>
             <w:r>
@@ -2367,6 +3447,12 @@
         <w:tc>
           <w:tcPr>
             <w:tcW w:type="dxa" w:w="2209"/>
+            <w:tcBorders>
+              <w:top w:val="single" w:sz="4" w:space="0" w:color="000000"/>
+              <w:left w:val="single" w:sz="4" w:space="0" w:color="000000"/>
+              <w:bottom w:val="single" w:sz="4" w:space="0" w:color="000000"/>
+              <w:right w:val="single" w:sz="4" w:space="0" w:color="000000"/>
+            </w:tcBorders>
           </w:tcPr>
           <w:p>
             <w:r>
@@ -2377,6 +3463,12 @@
         <w:tc>
           <w:tcPr>
             <w:tcW w:type="dxa" w:w="2209"/>
+            <w:tcBorders>
+              <w:top w:val="single" w:sz="4" w:space="0" w:color="000000"/>
+              <w:left w:val="single" w:sz="4" w:space="0" w:color="000000"/>
+              <w:bottom w:val="single" w:sz="4" w:space="0" w:color="000000"/>
+              <w:right w:val="single" w:sz="4" w:space="0" w:color="000000"/>
+            </w:tcBorders>
           </w:tcPr>
           <w:p>
             <w:r>
@@ -2387,6 +3479,12 @@
         <w:tc>
           <w:tcPr>
             <w:tcW w:type="dxa" w:w="2209"/>
+            <w:tcBorders>
+              <w:top w:val="single" w:sz="4" w:space="0" w:color="000000"/>
+              <w:left w:val="single" w:sz="4" w:space="0" w:color="000000"/>
+              <w:bottom w:val="single" w:sz="4" w:space="0" w:color="000000"/>
+              <w:right w:val="single" w:sz="4" w:space="0" w:color="000000"/>
+            </w:tcBorders>
           </w:tcPr>
           <w:p>
             <w:r>
@@ -2399,6 +3497,12 @@
         <w:tc>
           <w:tcPr>
             <w:tcW w:type="dxa" w:w="2209"/>
+            <w:tcBorders>
+              <w:top w:val="single" w:sz="4" w:space="0" w:color="000000"/>
+              <w:left w:val="single" w:sz="4" w:space="0" w:color="000000"/>
+              <w:bottom w:val="single" w:sz="4" w:space="0" w:color="000000"/>
+              <w:right w:val="single" w:sz="4" w:space="0" w:color="000000"/>
+            </w:tcBorders>
           </w:tcPr>
           <w:p>
             <w:r>
@@ -2409,6 +3513,12 @@
         <w:tc>
           <w:tcPr>
             <w:tcW w:type="dxa" w:w="2209"/>
+            <w:tcBorders>
+              <w:top w:val="single" w:sz="4" w:space="0" w:color="000000"/>
+              <w:left w:val="single" w:sz="4" w:space="0" w:color="000000"/>
+              <w:bottom w:val="single" w:sz="4" w:space="0" w:color="000000"/>
+              <w:right w:val="single" w:sz="4" w:space="0" w:color="000000"/>
+            </w:tcBorders>
           </w:tcPr>
           <w:p>
             <w:r>
@@ -2419,6 +3529,12 @@
         <w:tc>
           <w:tcPr>
             <w:tcW w:type="dxa" w:w="2209"/>
+            <w:tcBorders>
+              <w:top w:val="single" w:sz="4" w:space="0" w:color="000000"/>
+              <w:left w:val="single" w:sz="4" w:space="0" w:color="000000"/>
+              <w:bottom w:val="single" w:sz="4" w:space="0" w:color="000000"/>
+              <w:right w:val="single" w:sz="4" w:space="0" w:color="000000"/>
+            </w:tcBorders>
           </w:tcPr>
           <w:p>
             <w:r>
@@ -2429,6 +3545,12 @@
         <w:tc>
           <w:tcPr>
             <w:tcW w:type="dxa" w:w="2209"/>
+            <w:tcBorders>
+              <w:top w:val="single" w:sz="4" w:space="0" w:color="000000"/>
+              <w:left w:val="single" w:sz="4" w:space="0" w:color="000000"/>
+              <w:bottom w:val="single" w:sz="4" w:space="0" w:color="000000"/>
+              <w:right w:val="single" w:sz="4" w:space="0" w:color="000000"/>
+            </w:tcBorders>
           </w:tcPr>
           <w:p>
             <w:r>
@@ -2441,6 +3563,12 @@
         <w:tc>
           <w:tcPr>
             <w:tcW w:type="dxa" w:w="2209"/>
+            <w:tcBorders>
+              <w:top w:val="single" w:sz="4" w:space="0" w:color="000000"/>
+              <w:left w:val="single" w:sz="4" w:space="0" w:color="000000"/>
+              <w:bottom w:val="single" w:sz="4" w:space="0" w:color="000000"/>
+              <w:right w:val="single" w:sz="4" w:space="0" w:color="000000"/>
+            </w:tcBorders>
           </w:tcPr>
           <w:p>
             <w:r>
@@ -2451,6 +3579,12 @@
         <w:tc>
           <w:tcPr>
             <w:tcW w:type="dxa" w:w="2209"/>
+            <w:tcBorders>
+              <w:top w:val="single" w:sz="4" w:space="0" w:color="000000"/>
+              <w:left w:val="single" w:sz="4" w:space="0" w:color="000000"/>
+              <w:bottom w:val="single" w:sz="4" w:space="0" w:color="000000"/>
+              <w:right w:val="single" w:sz="4" w:space="0" w:color="000000"/>
+            </w:tcBorders>
           </w:tcPr>
           <w:p>
             <w:r>
@@ -2461,6 +3595,12 @@
         <w:tc>
           <w:tcPr>
             <w:tcW w:type="dxa" w:w="2209"/>
+            <w:tcBorders>
+              <w:top w:val="single" w:sz="4" w:space="0" w:color="000000"/>
+              <w:left w:val="single" w:sz="4" w:space="0" w:color="000000"/>
+              <w:bottom w:val="single" w:sz="4" w:space="0" w:color="000000"/>
+              <w:right w:val="single" w:sz="4" w:space="0" w:color="000000"/>
+            </w:tcBorders>
           </w:tcPr>
           <w:p>
             <w:r>
@@ -2471,6 +3611,12 @@
         <w:tc>
           <w:tcPr>
             <w:tcW w:type="dxa" w:w="2209"/>
+            <w:tcBorders>
+              <w:top w:val="single" w:sz="4" w:space="0" w:color="000000"/>
+              <w:left w:val="single" w:sz="4" w:space="0" w:color="000000"/>
+              <w:bottom w:val="single" w:sz="4" w:space="0" w:color="000000"/>
+              <w:right w:val="single" w:sz="4" w:space="0" w:color="000000"/>
+            </w:tcBorders>
           </w:tcPr>
           <w:p>
             <w:r>
@@ -2483,6 +3629,12 @@
         <w:tc>
           <w:tcPr>
             <w:tcW w:type="dxa" w:w="2209"/>
+            <w:tcBorders>
+              <w:top w:val="single" w:sz="4" w:space="0" w:color="000000"/>
+              <w:left w:val="single" w:sz="4" w:space="0" w:color="000000"/>
+              <w:bottom w:val="single" w:sz="4" w:space="0" w:color="000000"/>
+              <w:right w:val="single" w:sz="4" w:space="0" w:color="000000"/>
+            </w:tcBorders>
           </w:tcPr>
           <w:p>
             <w:r>
@@ -2493,6 +3645,12 @@
         <w:tc>
           <w:tcPr>
             <w:tcW w:type="dxa" w:w="2209"/>
+            <w:tcBorders>
+              <w:top w:val="single" w:sz="4" w:space="0" w:color="000000"/>
+              <w:left w:val="single" w:sz="4" w:space="0" w:color="000000"/>
+              <w:bottom w:val="single" w:sz="4" w:space="0" w:color="000000"/>
+              <w:right w:val="single" w:sz="4" w:space="0" w:color="000000"/>
+            </w:tcBorders>
           </w:tcPr>
           <w:p>
             <w:r>
@@ -2503,6 +3661,12 @@
         <w:tc>
           <w:tcPr>
             <w:tcW w:type="dxa" w:w="2209"/>
+            <w:tcBorders>
+              <w:top w:val="single" w:sz="4" w:space="0" w:color="000000"/>
+              <w:left w:val="single" w:sz="4" w:space="0" w:color="000000"/>
+              <w:bottom w:val="single" w:sz="4" w:space="0" w:color="000000"/>
+              <w:right w:val="single" w:sz="4" w:space="0" w:color="000000"/>
+            </w:tcBorders>
           </w:tcPr>
           <w:p>
             <w:r>
@@ -2513,6 +3677,12 @@
         <w:tc>
           <w:tcPr>
             <w:tcW w:type="dxa" w:w="2209"/>
+            <w:tcBorders>
+              <w:top w:val="single" w:sz="4" w:space="0" w:color="000000"/>
+              <w:left w:val="single" w:sz="4" w:space="0" w:color="000000"/>
+              <w:bottom w:val="single" w:sz="4" w:space="0" w:color="000000"/>
+              <w:right w:val="single" w:sz="4" w:space="0" w:color="000000"/>
+            </w:tcBorders>
           </w:tcPr>
           <w:p>
             <w:r>
@@ -2555,6 +3725,12 @@
         <w:tc>
           <w:tcPr>
             <w:tcW w:type="dxa" w:w="2209"/>
+            <w:tcBorders>
+              <w:top w:val="single" w:sz="4" w:space="0" w:color="000000"/>
+              <w:left w:val="single" w:sz="4" w:space="0" w:color="000000"/>
+              <w:bottom w:val="single" w:sz="4" w:space="0" w:color="000000"/>
+              <w:right w:val="single" w:sz="4" w:space="0" w:color="000000"/>
+            </w:tcBorders>
           </w:tcPr>
           <w:p>
             <w:r>
@@ -2568,6 +3744,12 @@
         <w:tc>
           <w:tcPr>
             <w:tcW w:type="dxa" w:w="2209"/>
+            <w:tcBorders>
+              <w:top w:val="single" w:sz="4" w:space="0" w:color="000000"/>
+              <w:left w:val="single" w:sz="4" w:space="0" w:color="000000"/>
+              <w:bottom w:val="single" w:sz="4" w:space="0" w:color="000000"/>
+              <w:right w:val="single" w:sz="4" w:space="0" w:color="000000"/>
+            </w:tcBorders>
           </w:tcPr>
           <w:p>
             <w:r>
@@ -2581,6 +3763,12 @@
         <w:tc>
           <w:tcPr>
             <w:tcW w:type="dxa" w:w="2209"/>
+            <w:tcBorders>
+              <w:top w:val="single" w:sz="4" w:space="0" w:color="000000"/>
+              <w:left w:val="single" w:sz="4" w:space="0" w:color="000000"/>
+              <w:bottom w:val="single" w:sz="4" w:space="0" w:color="000000"/>
+              <w:right w:val="single" w:sz="4" w:space="0" w:color="000000"/>
+            </w:tcBorders>
           </w:tcPr>
           <w:p>
             <w:r>
@@ -2594,6 +3782,12 @@
         <w:tc>
           <w:tcPr>
             <w:tcW w:type="dxa" w:w="2209"/>
+            <w:tcBorders>
+              <w:top w:val="single" w:sz="4" w:space="0" w:color="000000"/>
+              <w:left w:val="single" w:sz="4" w:space="0" w:color="000000"/>
+              <w:bottom w:val="single" w:sz="4" w:space="0" w:color="000000"/>
+              <w:right w:val="single" w:sz="4" w:space="0" w:color="000000"/>
+            </w:tcBorders>
           </w:tcPr>
           <w:p>
             <w:r>
@@ -2609,6 +3803,12 @@
         <w:tc>
           <w:tcPr>
             <w:tcW w:type="dxa" w:w="2209"/>
+            <w:tcBorders>
+              <w:top w:val="single" w:sz="4" w:space="0" w:color="000000"/>
+              <w:left w:val="single" w:sz="4" w:space="0" w:color="000000"/>
+              <w:bottom w:val="single" w:sz="4" w:space="0" w:color="000000"/>
+              <w:right w:val="single" w:sz="4" w:space="0" w:color="000000"/>
+            </w:tcBorders>
           </w:tcPr>
           <w:p>
             <w:r>
@@ -2619,6 +3819,12 @@
         <w:tc>
           <w:tcPr>
             <w:tcW w:type="dxa" w:w="2209"/>
+            <w:tcBorders>
+              <w:top w:val="single" w:sz="4" w:space="0" w:color="000000"/>
+              <w:left w:val="single" w:sz="4" w:space="0" w:color="000000"/>
+              <w:bottom w:val="single" w:sz="4" w:space="0" w:color="000000"/>
+              <w:right w:val="single" w:sz="4" w:space="0" w:color="000000"/>
+            </w:tcBorders>
           </w:tcPr>
           <w:p>
             <w:r>
@@ -2629,6 +3835,12 @@
         <w:tc>
           <w:tcPr>
             <w:tcW w:type="dxa" w:w="2209"/>
+            <w:tcBorders>
+              <w:top w:val="single" w:sz="4" w:space="0" w:color="000000"/>
+              <w:left w:val="single" w:sz="4" w:space="0" w:color="000000"/>
+              <w:bottom w:val="single" w:sz="4" w:space="0" w:color="000000"/>
+              <w:right w:val="single" w:sz="4" w:space="0" w:color="000000"/>
+            </w:tcBorders>
           </w:tcPr>
           <w:p>
             <w:r>
@@ -2639,6 +3851,12 @@
         <w:tc>
           <w:tcPr>
             <w:tcW w:type="dxa" w:w="2209"/>
+            <w:tcBorders>
+              <w:top w:val="single" w:sz="4" w:space="0" w:color="000000"/>
+              <w:left w:val="single" w:sz="4" w:space="0" w:color="000000"/>
+              <w:bottom w:val="single" w:sz="4" w:space="0" w:color="000000"/>
+              <w:right w:val="single" w:sz="4" w:space="0" w:color="000000"/>
+            </w:tcBorders>
           </w:tcPr>
           <w:p>
             <w:r>
@@ -2651,6 +3869,12 @@
         <w:tc>
           <w:tcPr>
             <w:tcW w:type="dxa" w:w="2209"/>
+            <w:tcBorders>
+              <w:top w:val="single" w:sz="4" w:space="0" w:color="000000"/>
+              <w:left w:val="single" w:sz="4" w:space="0" w:color="000000"/>
+              <w:bottom w:val="single" w:sz="4" w:space="0" w:color="000000"/>
+              <w:right w:val="single" w:sz="4" w:space="0" w:color="000000"/>
+            </w:tcBorders>
           </w:tcPr>
           <w:p>
             <w:r>
@@ -2661,6 +3885,12 @@
         <w:tc>
           <w:tcPr>
             <w:tcW w:type="dxa" w:w="2209"/>
+            <w:tcBorders>
+              <w:top w:val="single" w:sz="4" w:space="0" w:color="000000"/>
+              <w:left w:val="single" w:sz="4" w:space="0" w:color="000000"/>
+              <w:bottom w:val="single" w:sz="4" w:space="0" w:color="000000"/>
+              <w:right w:val="single" w:sz="4" w:space="0" w:color="000000"/>
+            </w:tcBorders>
           </w:tcPr>
           <w:p>
             <w:r>
@@ -2671,6 +3901,12 @@
         <w:tc>
           <w:tcPr>
             <w:tcW w:type="dxa" w:w="2209"/>
+            <w:tcBorders>
+              <w:top w:val="single" w:sz="4" w:space="0" w:color="000000"/>
+              <w:left w:val="single" w:sz="4" w:space="0" w:color="000000"/>
+              <w:bottom w:val="single" w:sz="4" w:space="0" w:color="000000"/>
+              <w:right w:val="single" w:sz="4" w:space="0" w:color="000000"/>
+            </w:tcBorders>
           </w:tcPr>
           <w:p>
             <w:r>
@@ -2681,6 +3917,12 @@
         <w:tc>
           <w:tcPr>
             <w:tcW w:type="dxa" w:w="2209"/>
+            <w:tcBorders>
+              <w:top w:val="single" w:sz="4" w:space="0" w:color="000000"/>
+              <w:left w:val="single" w:sz="4" w:space="0" w:color="000000"/>
+              <w:bottom w:val="single" w:sz="4" w:space="0" w:color="000000"/>
+              <w:right w:val="single" w:sz="4" w:space="0" w:color="000000"/>
+            </w:tcBorders>
           </w:tcPr>
           <w:p>
             <w:r>
@@ -2693,6 +3935,12 @@
         <w:tc>
           <w:tcPr>
             <w:tcW w:type="dxa" w:w="2209"/>
+            <w:tcBorders>
+              <w:top w:val="single" w:sz="4" w:space="0" w:color="000000"/>
+              <w:left w:val="single" w:sz="4" w:space="0" w:color="000000"/>
+              <w:bottom w:val="single" w:sz="4" w:space="0" w:color="000000"/>
+              <w:right w:val="single" w:sz="4" w:space="0" w:color="000000"/>
+            </w:tcBorders>
           </w:tcPr>
           <w:p>
             <w:r>
@@ -2703,6 +3951,12 @@
         <w:tc>
           <w:tcPr>
             <w:tcW w:type="dxa" w:w="2209"/>
+            <w:tcBorders>
+              <w:top w:val="single" w:sz="4" w:space="0" w:color="000000"/>
+              <w:left w:val="single" w:sz="4" w:space="0" w:color="000000"/>
+              <w:bottom w:val="single" w:sz="4" w:space="0" w:color="000000"/>
+              <w:right w:val="single" w:sz="4" w:space="0" w:color="000000"/>
+            </w:tcBorders>
           </w:tcPr>
           <w:p>
             <w:r>
@@ -2713,6 +3967,12 @@
         <w:tc>
           <w:tcPr>
             <w:tcW w:type="dxa" w:w="2209"/>
+            <w:tcBorders>
+              <w:top w:val="single" w:sz="4" w:space="0" w:color="000000"/>
+              <w:left w:val="single" w:sz="4" w:space="0" w:color="000000"/>
+              <w:bottom w:val="single" w:sz="4" w:space="0" w:color="000000"/>
+              <w:right w:val="single" w:sz="4" w:space="0" w:color="000000"/>
+            </w:tcBorders>
           </w:tcPr>
           <w:p>
             <w:r>
@@ -2723,6 +3983,12 @@
         <w:tc>
           <w:tcPr>
             <w:tcW w:type="dxa" w:w="2209"/>
+            <w:tcBorders>
+              <w:top w:val="single" w:sz="4" w:space="0" w:color="000000"/>
+              <w:left w:val="single" w:sz="4" w:space="0" w:color="000000"/>
+              <w:bottom w:val="single" w:sz="4" w:space="0" w:color="000000"/>
+              <w:right w:val="single" w:sz="4" w:space="0" w:color="000000"/>
+            </w:tcBorders>
           </w:tcPr>
           <w:p>
             <w:r>
@@ -2735,6 +4001,12 @@
         <w:tc>
           <w:tcPr>
             <w:tcW w:type="dxa" w:w="2209"/>
+            <w:tcBorders>
+              <w:top w:val="single" w:sz="4" w:space="0" w:color="000000"/>
+              <w:left w:val="single" w:sz="4" w:space="0" w:color="000000"/>
+              <w:bottom w:val="single" w:sz="4" w:space="0" w:color="000000"/>
+              <w:right w:val="single" w:sz="4" w:space="0" w:color="000000"/>
+            </w:tcBorders>
           </w:tcPr>
           <w:p>
             <w:r>
@@ -2745,6 +4017,12 @@
         <w:tc>
           <w:tcPr>
             <w:tcW w:type="dxa" w:w="2209"/>
+            <w:tcBorders>
+              <w:top w:val="single" w:sz="4" w:space="0" w:color="000000"/>
+              <w:left w:val="single" w:sz="4" w:space="0" w:color="000000"/>
+              <w:bottom w:val="single" w:sz="4" w:space="0" w:color="000000"/>
+              <w:right w:val="single" w:sz="4" w:space="0" w:color="000000"/>
+            </w:tcBorders>
           </w:tcPr>
           <w:p>
             <w:r>
@@ -2755,6 +4033,12 @@
         <w:tc>
           <w:tcPr>
             <w:tcW w:type="dxa" w:w="2209"/>
+            <w:tcBorders>
+              <w:top w:val="single" w:sz="4" w:space="0" w:color="000000"/>
+              <w:left w:val="single" w:sz="4" w:space="0" w:color="000000"/>
+              <w:bottom w:val="single" w:sz="4" w:space="0" w:color="000000"/>
+              <w:right w:val="single" w:sz="4" w:space="0" w:color="000000"/>
+            </w:tcBorders>
           </w:tcPr>
           <w:p>
             <w:r>
@@ -2765,6 +4049,12 @@
         <w:tc>
           <w:tcPr>
             <w:tcW w:type="dxa" w:w="2209"/>
+            <w:tcBorders>
+              <w:top w:val="single" w:sz="4" w:space="0" w:color="000000"/>
+              <w:left w:val="single" w:sz="4" w:space="0" w:color="000000"/>
+              <w:bottom w:val="single" w:sz="4" w:space="0" w:color="000000"/>
+              <w:right w:val="single" w:sz="4" w:space="0" w:color="000000"/>
+            </w:tcBorders>
           </w:tcPr>
           <w:p>
             <w:r>
@@ -2777,6 +4067,12 @@
         <w:tc>
           <w:tcPr>
             <w:tcW w:type="dxa" w:w="2209"/>
+            <w:tcBorders>
+              <w:top w:val="single" w:sz="4" w:space="0" w:color="000000"/>
+              <w:left w:val="single" w:sz="4" w:space="0" w:color="000000"/>
+              <w:bottom w:val="single" w:sz="4" w:space="0" w:color="000000"/>
+              <w:right w:val="single" w:sz="4" w:space="0" w:color="000000"/>
+            </w:tcBorders>
           </w:tcPr>
           <w:p>
             <w:r>
@@ -2787,6 +4083,12 @@
         <w:tc>
           <w:tcPr>
             <w:tcW w:type="dxa" w:w="2209"/>
+            <w:tcBorders>
+              <w:top w:val="single" w:sz="4" w:space="0" w:color="000000"/>
+              <w:left w:val="single" w:sz="4" w:space="0" w:color="000000"/>
+              <w:bottom w:val="single" w:sz="4" w:space="0" w:color="000000"/>
+              <w:right w:val="single" w:sz="4" w:space="0" w:color="000000"/>
+            </w:tcBorders>
           </w:tcPr>
           <w:p>
             <w:r>
@@ -2797,6 +4099,12 @@
         <w:tc>
           <w:tcPr>
             <w:tcW w:type="dxa" w:w="2209"/>
+            <w:tcBorders>
+              <w:top w:val="single" w:sz="4" w:space="0" w:color="000000"/>
+              <w:left w:val="single" w:sz="4" w:space="0" w:color="000000"/>
+              <w:bottom w:val="single" w:sz="4" w:space="0" w:color="000000"/>
+              <w:right w:val="single" w:sz="4" w:space="0" w:color="000000"/>
+            </w:tcBorders>
           </w:tcPr>
           <w:p>
             <w:r>
@@ -2807,6 +4115,12 @@
         <w:tc>
           <w:tcPr>
             <w:tcW w:type="dxa" w:w="2209"/>
+            <w:tcBorders>
+              <w:top w:val="single" w:sz="4" w:space="0" w:color="000000"/>
+              <w:left w:val="single" w:sz="4" w:space="0" w:color="000000"/>
+              <w:bottom w:val="single" w:sz="4" w:space="0" w:color="000000"/>
+              <w:right w:val="single" w:sz="4" w:space="0" w:color="000000"/>
+            </w:tcBorders>
           </w:tcPr>
           <w:p>
             <w:r>
@@ -2819,6 +4133,12 @@
         <w:tc>
           <w:tcPr>
             <w:tcW w:type="dxa" w:w="2209"/>
+            <w:tcBorders>
+              <w:top w:val="single" w:sz="4" w:space="0" w:color="000000"/>
+              <w:left w:val="single" w:sz="4" w:space="0" w:color="000000"/>
+              <w:bottom w:val="single" w:sz="4" w:space="0" w:color="000000"/>
+              <w:right w:val="single" w:sz="4" w:space="0" w:color="000000"/>
+            </w:tcBorders>
           </w:tcPr>
           <w:p>
             <w:r>
@@ -2829,6 +4149,12 @@
         <w:tc>
           <w:tcPr>
             <w:tcW w:type="dxa" w:w="2209"/>
+            <w:tcBorders>
+              <w:top w:val="single" w:sz="4" w:space="0" w:color="000000"/>
+              <w:left w:val="single" w:sz="4" w:space="0" w:color="000000"/>
+              <w:bottom w:val="single" w:sz="4" w:space="0" w:color="000000"/>
+              <w:right w:val="single" w:sz="4" w:space="0" w:color="000000"/>
+            </w:tcBorders>
           </w:tcPr>
           <w:p>
             <w:r>
@@ -2839,6 +4165,12 @@
         <w:tc>
           <w:tcPr>
             <w:tcW w:type="dxa" w:w="2209"/>
+            <w:tcBorders>
+              <w:top w:val="single" w:sz="4" w:space="0" w:color="000000"/>
+              <w:left w:val="single" w:sz="4" w:space="0" w:color="000000"/>
+              <w:bottom w:val="single" w:sz="4" w:space="0" w:color="000000"/>
+              <w:right w:val="single" w:sz="4" w:space="0" w:color="000000"/>
+            </w:tcBorders>
           </w:tcPr>
           <w:p>
             <w:r>
@@ -2849,6 +4181,12 @@
         <w:tc>
           <w:tcPr>
             <w:tcW w:type="dxa" w:w="2209"/>
+            <w:tcBorders>
+              <w:top w:val="single" w:sz="4" w:space="0" w:color="000000"/>
+              <w:left w:val="single" w:sz="4" w:space="0" w:color="000000"/>
+              <w:bottom w:val="single" w:sz="4" w:space="0" w:color="000000"/>
+              <w:right w:val="single" w:sz="4" w:space="0" w:color="000000"/>
+            </w:tcBorders>
           </w:tcPr>
           <w:p>
             <w:r>
@@ -3035,6 +4373,12 @@
         <w:tc>
           <w:tcPr>
             <w:tcW w:type="dxa" w:w="2946"/>
+            <w:tcBorders>
+              <w:top w:val="single" w:sz="4" w:space="0" w:color="000000"/>
+              <w:left w:val="single" w:sz="4" w:space="0" w:color="000000"/>
+              <w:bottom w:val="single" w:sz="4" w:space="0" w:color="000000"/>
+              <w:right w:val="single" w:sz="4" w:space="0" w:color="000000"/>
+            </w:tcBorders>
           </w:tcPr>
           <w:p>
             <w:r>
@@ -3048,6 +4392,12 @@
         <w:tc>
           <w:tcPr>
             <w:tcW w:type="dxa" w:w="2946"/>
+            <w:tcBorders>
+              <w:top w:val="single" w:sz="4" w:space="0" w:color="000000"/>
+              <w:left w:val="single" w:sz="4" w:space="0" w:color="000000"/>
+              <w:bottom w:val="single" w:sz="4" w:space="0" w:color="000000"/>
+              <w:right w:val="single" w:sz="4" w:space="0" w:color="000000"/>
+            </w:tcBorders>
           </w:tcPr>
           <w:p>
             <w:r>
@@ -3061,6 +4411,12 @@
         <w:tc>
           <w:tcPr>
             <w:tcW w:type="dxa" w:w="2946"/>
+            <w:tcBorders>
+              <w:top w:val="single" w:sz="4" w:space="0" w:color="000000"/>
+              <w:left w:val="single" w:sz="4" w:space="0" w:color="000000"/>
+              <w:bottom w:val="single" w:sz="4" w:space="0" w:color="000000"/>
+              <w:right w:val="single" w:sz="4" w:space="0" w:color="000000"/>
+            </w:tcBorders>
           </w:tcPr>
           <w:p>
             <w:r>
@@ -3076,6 +4432,12 @@
         <w:tc>
           <w:tcPr>
             <w:tcW w:type="dxa" w:w="2946"/>
+            <w:tcBorders>
+              <w:top w:val="single" w:sz="4" w:space="0" w:color="000000"/>
+              <w:left w:val="single" w:sz="4" w:space="0" w:color="000000"/>
+              <w:bottom w:val="single" w:sz="4" w:space="0" w:color="000000"/>
+              <w:right w:val="single" w:sz="4" w:space="0" w:color="000000"/>
+            </w:tcBorders>
           </w:tcPr>
           <w:p>
             <w:r>
@@ -3086,6 +4448,12 @@
         <w:tc>
           <w:tcPr>
             <w:tcW w:type="dxa" w:w="2946"/>
+            <w:tcBorders>
+              <w:top w:val="single" w:sz="4" w:space="0" w:color="000000"/>
+              <w:left w:val="single" w:sz="4" w:space="0" w:color="000000"/>
+              <w:bottom w:val="single" w:sz="4" w:space="0" w:color="000000"/>
+              <w:right w:val="single" w:sz="4" w:space="0" w:color="000000"/>
+            </w:tcBorders>
           </w:tcPr>
           <w:p>
             <w:r>
@@ -3096,6 +4464,12 @@
         <w:tc>
           <w:tcPr>
             <w:tcW w:type="dxa" w:w="2946"/>
+            <w:tcBorders>
+              <w:top w:val="single" w:sz="4" w:space="0" w:color="000000"/>
+              <w:left w:val="single" w:sz="4" w:space="0" w:color="000000"/>
+              <w:bottom w:val="single" w:sz="4" w:space="0" w:color="000000"/>
+              <w:right w:val="single" w:sz="4" w:space="0" w:color="000000"/>
+            </w:tcBorders>
           </w:tcPr>
           <w:p>
             <w:r>
@@ -3108,6 +4482,12 @@
         <w:tc>
           <w:tcPr>
             <w:tcW w:type="dxa" w:w="2946"/>
+            <w:tcBorders>
+              <w:top w:val="single" w:sz="4" w:space="0" w:color="000000"/>
+              <w:left w:val="single" w:sz="4" w:space="0" w:color="000000"/>
+              <w:bottom w:val="single" w:sz="4" w:space="0" w:color="000000"/>
+              <w:right w:val="single" w:sz="4" w:space="0" w:color="000000"/>
+            </w:tcBorders>
           </w:tcPr>
           <w:p>
             <w:r>
@@ -3118,6 +4498,12 @@
         <w:tc>
           <w:tcPr>
             <w:tcW w:type="dxa" w:w="2946"/>
+            <w:tcBorders>
+              <w:top w:val="single" w:sz="4" w:space="0" w:color="000000"/>
+              <w:left w:val="single" w:sz="4" w:space="0" w:color="000000"/>
+              <w:bottom w:val="single" w:sz="4" w:space="0" w:color="000000"/>
+              <w:right w:val="single" w:sz="4" w:space="0" w:color="000000"/>
+            </w:tcBorders>
           </w:tcPr>
           <w:p>
             <w:r>
@@ -3128,6 +4514,12 @@
         <w:tc>
           <w:tcPr>
             <w:tcW w:type="dxa" w:w="2946"/>
+            <w:tcBorders>
+              <w:top w:val="single" w:sz="4" w:space="0" w:color="000000"/>
+              <w:left w:val="single" w:sz="4" w:space="0" w:color="000000"/>
+              <w:bottom w:val="single" w:sz="4" w:space="0" w:color="000000"/>
+              <w:right w:val="single" w:sz="4" w:space="0" w:color="000000"/>
+            </w:tcBorders>
           </w:tcPr>
           <w:p>
             <w:r>
@@ -3140,6 +4532,12 @@
         <w:tc>
           <w:tcPr>
             <w:tcW w:type="dxa" w:w="2946"/>
+            <w:tcBorders>
+              <w:top w:val="single" w:sz="4" w:space="0" w:color="000000"/>
+              <w:left w:val="single" w:sz="4" w:space="0" w:color="000000"/>
+              <w:bottom w:val="single" w:sz="4" w:space="0" w:color="000000"/>
+              <w:right w:val="single" w:sz="4" w:space="0" w:color="000000"/>
+            </w:tcBorders>
           </w:tcPr>
           <w:p>
             <w:r>
@@ -3150,6 +4548,12 @@
         <w:tc>
           <w:tcPr>
             <w:tcW w:type="dxa" w:w="2946"/>
+            <w:tcBorders>
+              <w:top w:val="single" w:sz="4" w:space="0" w:color="000000"/>
+              <w:left w:val="single" w:sz="4" w:space="0" w:color="000000"/>
+              <w:bottom w:val="single" w:sz="4" w:space="0" w:color="000000"/>
+              <w:right w:val="single" w:sz="4" w:space="0" w:color="000000"/>
+            </w:tcBorders>
           </w:tcPr>
           <w:p>
             <w:r>
@@ -3160,6 +4564,12 @@
         <w:tc>
           <w:tcPr>
             <w:tcW w:type="dxa" w:w="2946"/>
+            <w:tcBorders>
+              <w:top w:val="single" w:sz="4" w:space="0" w:color="000000"/>
+              <w:left w:val="single" w:sz="4" w:space="0" w:color="000000"/>
+              <w:bottom w:val="single" w:sz="4" w:space="0" w:color="000000"/>
+              <w:right w:val="single" w:sz="4" w:space="0" w:color="000000"/>
+            </w:tcBorders>
           </w:tcPr>
           <w:p>
             <w:r>
@@ -3172,6 +4582,12 @@
         <w:tc>
           <w:tcPr>
             <w:tcW w:type="dxa" w:w="2946"/>
+            <w:tcBorders>
+              <w:top w:val="single" w:sz="4" w:space="0" w:color="000000"/>
+              <w:left w:val="single" w:sz="4" w:space="0" w:color="000000"/>
+              <w:bottom w:val="single" w:sz="4" w:space="0" w:color="000000"/>
+              <w:right w:val="single" w:sz="4" w:space="0" w:color="000000"/>
+            </w:tcBorders>
           </w:tcPr>
           <w:p>
             <w:r>
@@ -3182,6 +4598,12 @@
         <w:tc>
           <w:tcPr>
             <w:tcW w:type="dxa" w:w="2946"/>
+            <w:tcBorders>
+              <w:top w:val="single" w:sz="4" w:space="0" w:color="000000"/>
+              <w:left w:val="single" w:sz="4" w:space="0" w:color="000000"/>
+              <w:bottom w:val="single" w:sz="4" w:space="0" w:color="000000"/>
+              <w:right w:val="single" w:sz="4" w:space="0" w:color="000000"/>
+            </w:tcBorders>
           </w:tcPr>
           <w:p>
             <w:r>
@@ -3192,6 +4614,12 @@
         <w:tc>
           <w:tcPr>
             <w:tcW w:type="dxa" w:w="2946"/>
+            <w:tcBorders>
+              <w:top w:val="single" w:sz="4" w:space="0" w:color="000000"/>
+              <w:left w:val="single" w:sz="4" w:space="0" w:color="000000"/>
+              <w:bottom w:val="single" w:sz="4" w:space="0" w:color="000000"/>
+              <w:right w:val="single" w:sz="4" w:space="0" w:color="000000"/>
+            </w:tcBorders>
           </w:tcPr>
           <w:p>
             <w:r>
@@ -3204,6 +4632,12 @@
         <w:tc>
           <w:tcPr>
             <w:tcW w:type="dxa" w:w="2946"/>
+            <w:tcBorders>
+              <w:top w:val="single" w:sz="4" w:space="0" w:color="000000"/>
+              <w:left w:val="single" w:sz="4" w:space="0" w:color="000000"/>
+              <w:bottom w:val="single" w:sz="4" w:space="0" w:color="000000"/>
+              <w:right w:val="single" w:sz="4" w:space="0" w:color="000000"/>
+            </w:tcBorders>
           </w:tcPr>
           <w:p>
             <w:r>
@@ -3214,6 +4648,12 @@
         <w:tc>
           <w:tcPr>
             <w:tcW w:type="dxa" w:w="2946"/>
+            <w:tcBorders>
+              <w:top w:val="single" w:sz="4" w:space="0" w:color="000000"/>
+              <w:left w:val="single" w:sz="4" w:space="0" w:color="000000"/>
+              <w:bottom w:val="single" w:sz="4" w:space="0" w:color="000000"/>
+              <w:right w:val="single" w:sz="4" w:space="0" w:color="000000"/>
+            </w:tcBorders>
           </w:tcPr>
           <w:p>
             <w:r>
@@ -3224,6 +4664,12 @@
         <w:tc>
           <w:tcPr>
             <w:tcW w:type="dxa" w:w="2946"/>
+            <w:tcBorders>
+              <w:top w:val="single" w:sz="4" w:space="0" w:color="000000"/>
+              <w:left w:val="single" w:sz="4" w:space="0" w:color="000000"/>
+              <w:bottom w:val="single" w:sz="4" w:space="0" w:color="000000"/>
+              <w:right w:val="single" w:sz="4" w:space="0" w:color="000000"/>
+            </w:tcBorders>
           </w:tcPr>
           <w:p>
             <w:r>
@@ -3236,6 +4682,12 @@
         <w:tc>
           <w:tcPr>
             <w:tcW w:type="dxa" w:w="2946"/>
+            <w:tcBorders>
+              <w:top w:val="single" w:sz="4" w:space="0" w:color="000000"/>
+              <w:left w:val="single" w:sz="4" w:space="0" w:color="000000"/>
+              <w:bottom w:val="single" w:sz="4" w:space="0" w:color="000000"/>
+              <w:right w:val="single" w:sz="4" w:space="0" w:color="000000"/>
+            </w:tcBorders>
           </w:tcPr>
           <w:p>
             <w:r>
@@ -3246,6 +4698,12 @@
         <w:tc>
           <w:tcPr>
             <w:tcW w:type="dxa" w:w="2946"/>
+            <w:tcBorders>
+              <w:top w:val="single" w:sz="4" w:space="0" w:color="000000"/>
+              <w:left w:val="single" w:sz="4" w:space="0" w:color="000000"/>
+              <w:bottom w:val="single" w:sz="4" w:space="0" w:color="000000"/>
+              <w:right w:val="single" w:sz="4" w:space="0" w:color="000000"/>
+            </w:tcBorders>
           </w:tcPr>
           <w:p>
             <w:r>
@@ -3256,6 +4714,12 @@
         <w:tc>
           <w:tcPr>
             <w:tcW w:type="dxa" w:w="2946"/>
+            <w:tcBorders>
+              <w:top w:val="single" w:sz="4" w:space="0" w:color="000000"/>
+              <w:left w:val="single" w:sz="4" w:space="0" w:color="000000"/>
+              <w:bottom w:val="single" w:sz="4" w:space="0" w:color="000000"/>
+              <w:right w:val="single" w:sz="4" w:space="0" w:color="000000"/>
+            </w:tcBorders>
           </w:tcPr>
           <w:p>
             <w:r>
@@ -3337,6 +4801,12 @@
         <w:tc>
           <w:tcPr>
             <w:tcW w:type="dxa" w:w="4419"/>
+            <w:tcBorders>
+              <w:top w:val="single" w:sz="4" w:space="0" w:color="000000"/>
+              <w:left w:val="single" w:sz="4" w:space="0" w:color="000000"/>
+              <w:bottom w:val="single" w:sz="4" w:space="0" w:color="000000"/>
+              <w:right w:val="single" w:sz="4" w:space="0" w:color="000000"/>
+            </w:tcBorders>
           </w:tcPr>
           <w:p>
             <w:r>
@@ -3350,6 +4820,12 @@
         <w:tc>
           <w:tcPr>
             <w:tcW w:type="dxa" w:w="4419"/>
+            <w:tcBorders>
+              <w:top w:val="single" w:sz="4" w:space="0" w:color="000000"/>
+              <w:left w:val="single" w:sz="4" w:space="0" w:color="000000"/>
+              <w:bottom w:val="single" w:sz="4" w:space="0" w:color="000000"/>
+              <w:right w:val="single" w:sz="4" w:space="0" w:color="000000"/>
+            </w:tcBorders>
           </w:tcPr>
           <w:p>
             <w:r>
@@ -3365,6 +4841,12 @@
         <w:tc>
           <w:tcPr>
             <w:tcW w:type="dxa" w:w="4419"/>
+            <w:tcBorders>
+              <w:top w:val="single" w:sz="4" w:space="0" w:color="000000"/>
+              <w:left w:val="single" w:sz="4" w:space="0" w:color="000000"/>
+              <w:bottom w:val="single" w:sz="4" w:space="0" w:color="000000"/>
+              <w:right w:val="single" w:sz="4" w:space="0" w:color="000000"/>
+            </w:tcBorders>
           </w:tcPr>
           <w:p>
             <w:r>
@@ -3375,6 +4857,12 @@
         <w:tc>
           <w:tcPr>
             <w:tcW w:type="dxa" w:w="4419"/>
+            <w:tcBorders>
+              <w:top w:val="single" w:sz="4" w:space="0" w:color="000000"/>
+              <w:left w:val="single" w:sz="4" w:space="0" w:color="000000"/>
+              <w:bottom w:val="single" w:sz="4" w:space="0" w:color="000000"/>
+              <w:right w:val="single" w:sz="4" w:space="0" w:color="000000"/>
+            </w:tcBorders>
           </w:tcPr>
           <w:p>
             <w:r>
@@ -3387,6 +4875,12 @@
         <w:tc>
           <w:tcPr>
             <w:tcW w:type="dxa" w:w="4419"/>
+            <w:tcBorders>
+              <w:top w:val="single" w:sz="4" w:space="0" w:color="000000"/>
+              <w:left w:val="single" w:sz="4" w:space="0" w:color="000000"/>
+              <w:bottom w:val="single" w:sz="4" w:space="0" w:color="000000"/>
+              <w:right w:val="single" w:sz="4" w:space="0" w:color="000000"/>
+            </w:tcBorders>
           </w:tcPr>
           <w:p>
             <w:r>
@@ -3397,6 +4891,12 @@
         <w:tc>
           <w:tcPr>
             <w:tcW w:type="dxa" w:w="4419"/>
+            <w:tcBorders>
+              <w:top w:val="single" w:sz="4" w:space="0" w:color="000000"/>
+              <w:left w:val="single" w:sz="4" w:space="0" w:color="000000"/>
+              <w:bottom w:val="single" w:sz="4" w:space="0" w:color="000000"/>
+              <w:right w:val="single" w:sz="4" w:space="0" w:color="000000"/>
+            </w:tcBorders>
           </w:tcPr>
           <w:p>
             <w:r>
@@ -3409,6 +4909,12 @@
         <w:tc>
           <w:tcPr>
             <w:tcW w:type="dxa" w:w="4419"/>
+            <w:tcBorders>
+              <w:top w:val="single" w:sz="4" w:space="0" w:color="000000"/>
+              <w:left w:val="single" w:sz="4" w:space="0" w:color="000000"/>
+              <w:bottom w:val="single" w:sz="4" w:space="0" w:color="000000"/>
+              <w:right w:val="single" w:sz="4" w:space="0" w:color="000000"/>
+            </w:tcBorders>
           </w:tcPr>
           <w:p>
             <w:r>
@@ -3419,6 +4925,12 @@
         <w:tc>
           <w:tcPr>
             <w:tcW w:type="dxa" w:w="4419"/>
+            <w:tcBorders>
+              <w:top w:val="single" w:sz="4" w:space="0" w:color="000000"/>
+              <w:left w:val="single" w:sz="4" w:space="0" w:color="000000"/>
+              <w:bottom w:val="single" w:sz="4" w:space="0" w:color="000000"/>
+              <w:right w:val="single" w:sz="4" w:space="0" w:color="000000"/>
+            </w:tcBorders>
           </w:tcPr>
           <w:p>
             <w:r>
@@ -3431,6 +4943,12 @@
         <w:tc>
           <w:tcPr>
             <w:tcW w:type="dxa" w:w="4419"/>
+            <w:tcBorders>
+              <w:top w:val="single" w:sz="4" w:space="0" w:color="000000"/>
+              <w:left w:val="single" w:sz="4" w:space="0" w:color="000000"/>
+              <w:bottom w:val="single" w:sz="4" w:space="0" w:color="000000"/>
+              <w:right w:val="single" w:sz="4" w:space="0" w:color="000000"/>
+            </w:tcBorders>
           </w:tcPr>
           <w:p>
             <w:r>
@@ -3441,6 +4959,12 @@
         <w:tc>
           <w:tcPr>
             <w:tcW w:type="dxa" w:w="4419"/>
+            <w:tcBorders>
+              <w:top w:val="single" w:sz="4" w:space="0" w:color="000000"/>
+              <w:left w:val="single" w:sz="4" w:space="0" w:color="000000"/>
+              <w:bottom w:val="single" w:sz="4" w:space="0" w:color="000000"/>
+              <w:right w:val="single" w:sz="4" w:space="0" w:color="000000"/>
+            </w:tcBorders>
           </w:tcPr>
           <w:p>
             <w:r>
@@ -3453,6 +4977,12 @@
         <w:tc>
           <w:tcPr>
             <w:tcW w:type="dxa" w:w="4419"/>
+            <w:tcBorders>
+              <w:top w:val="single" w:sz="4" w:space="0" w:color="000000"/>
+              <w:left w:val="single" w:sz="4" w:space="0" w:color="000000"/>
+              <w:bottom w:val="single" w:sz="4" w:space="0" w:color="000000"/>
+              <w:right w:val="single" w:sz="4" w:space="0" w:color="000000"/>
+            </w:tcBorders>
           </w:tcPr>
           <w:p>
             <w:r>
@@ -3463,6 +4993,12 @@
         <w:tc>
           <w:tcPr>
             <w:tcW w:type="dxa" w:w="4419"/>
+            <w:tcBorders>
+              <w:top w:val="single" w:sz="4" w:space="0" w:color="000000"/>
+              <w:left w:val="single" w:sz="4" w:space="0" w:color="000000"/>
+              <w:bottom w:val="single" w:sz="4" w:space="0" w:color="000000"/>
+              <w:right w:val="single" w:sz="4" w:space="0" w:color="000000"/>
+            </w:tcBorders>
           </w:tcPr>
           <w:p>
             <w:r>
@@ -3475,6 +5011,12 @@
         <w:tc>
           <w:tcPr>
             <w:tcW w:type="dxa" w:w="4419"/>
+            <w:tcBorders>
+              <w:top w:val="single" w:sz="4" w:space="0" w:color="000000"/>
+              <w:left w:val="single" w:sz="4" w:space="0" w:color="000000"/>
+              <w:bottom w:val="single" w:sz="4" w:space="0" w:color="000000"/>
+              <w:right w:val="single" w:sz="4" w:space="0" w:color="000000"/>
+            </w:tcBorders>
           </w:tcPr>
           <w:p>
             <w:r>
@@ -3485,6 +5027,12 @@
         <w:tc>
           <w:tcPr>
             <w:tcW w:type="dxa" w:w="4419"/>
+            <w:tcBorders>
+              <w:top w:val="single" w:sz="4" w:space="0" w:color="000000"/>
+              <w:left w:val="single" w:sz="4" w:space="0" w:color="000000"/>
+              <w:bottom w:val="single" w:sz="4" w:space="0" w:color="000000"/>
+              <w:right w:val="single" w:sz="4" w:space="0" w:color="000000"/>
+            </w:tcBorders>
           </w:tcPr>
           <w:p>
             <w:r>
@@ -3497,6 +5045,12 @@
         <w:tc>
           <w:tcPr>
             <w:tcW w:type="dxa" w:w="4419"/>
+            <w:tcBorders>
+              <w:top w:val="single" w:sz="4" w:space="0" w:color="000000"/>
+              <w:left w:val="single" w:sz="4" w:space="0" w:color="000000"/>
+              <w:bottom w:val="single" w:sz="4" w:space="0" w:color="000000"/>
+              <w:right w:val="single" w:sz="4" w:space="0" w:color="000000"/>
+            </w:tcBorders>
           </w:tcPr>
           <w:p>
             <w:r>
@@ -3507,6 +5061,12 @@
         <w:tc>
           <w:tcPr>
             <w:tcW w:type="dxa" w:w="4419"/>
+            <w:tcBorders>
+              <w:top w:val="single" w:sz="4" w:space="0" w:color="000000"/>
+              <w:left w:val="single" w:sz="4" w:space="0" w:color="000000"/>
+              <w:bottom w:val="single" w:sz="4" w:space="0" w:color="000000"/>
+              <w:right w:val="single" w:sz="4" w:space="0" w:color="000000"/>
+            </w:tcBorders>
           </w:tcPr>
           <w:p>
             <w:r>
@@ -3519,6 +5079,12 @@
         <w:tc>
           <w:tcPr>
             <w:tcW w:type="dxa" w:w="4419"/>
+            <w:tcBorders>
+              <w:top w:val="single" w:sz="4" w:space="0" w:color="000000"/>
+              <w:left w:val="single" w:sz="4" w:space="0" w:color="000000"/>
+              <w:bottom w:val="single" w:sz="4" w:space="0" w:color="000000"/>
+              <w:right w:val="single" w:sz="4" w:space="0" w:color="000000"/>
+            </w:tcBorders>
           </w:tcPr>
           <w:p>
             <w:r>
@@ -3529,6 +5095,12 @@
         <w:tc>
           <w:tcPr>
             <w:tcW w:type="dxa" w:w="4419"/>
+            <w:tcBorders>
+              <w:top w:val="single" w:sz="4" w:space="0" w:color="000000"/>
+              <w:left w:val="single" w:sz="4" w:space="0" w:color="000000"/>
+              <w:bottom w:val="single" w:sz="4" w:space="0" w:color="000000"/>
+              <w:right w:val="single" w:sz="4" w:space="0" w:color="000000"/>
+            </w:tcBorders>
           </w:tcPr>
           <w:p>
             <w:r>
@@ -3541,6 +5113,12 @@
         <w:tc>
           <w:tcPr>
             <w:tcW w:type="dxa" w:w="4419"/>
+            <w:tcBorders>
+              <w:top w:val="single" w:sz="4" w:space="0" w:color="000000"/>
+              <w:left w:val="single" w:sz="4" w:space="0" w:color="000000"/>
+              <w:bottom w:val="single" w:sz="4" w:space="0" w:color="000000"/>
+              <w:right w:val="single" w:sz="4" w:space="0" w:color="000000"/>
+            </w:tcBorders>
           </w:tcPr>
           <w:p>
             <w:r>
@@ -3551,6 +5129,12 @@
         <w:tc>
           <w:tcPr>
             <w:tcW w:type="dxa" w:w="4419"/>
+            <w:tcBorders>
+              <w:top w:val="single" w:sz="4" w:space="0" w:color="000000"/>
+              <w:left w:val="single" w:sz="4" w:space="0" w:color="000000"/>
+              <w:bottom w:val="single" w:sz="4" w:space="0" w:color="000000"/>
+              <w:right w:val="single" w:sz="4" w:space="0" w:color="000000"/>
+            </w:tcBorders>
           </w:tcPr>
           <w:p>
             <w:r>
@@ -3563,6 +5147,12 @@
         <w:tc>
           <w:tcPr>
             <w:tcW w:type="dxa" w:w="4419"/>
+            <w:tcBorders>
+              <w:top w:val="single" w:sz="4" w:space="0" w:color="000000"/>
+              <w:left w:val="single" w:sz="4" w:space="0" w:color="000000"/>
+              <w:bottom w:val="single" w:sz="4" w:space="0" w:color="000000"/>
+              <w:right w:val="single" w:sz="4" w:space="0" w:color="000000"/>
+            </w:tcBorders>
           </w:tcPr>
           <w:p>
             <w:r>
@@ -3573,6 +5163,12 @@
         <w:tc>
           <w:tcPr>
             <w:tcW w:type="dxa" w:w="4419"/>
+            <w:tcBorders>
+              <w:top w:val="single" w:sz="4" w:space="0" w:color="000000"/>
+              <w:left w:val="single" w:sz="4" w:space="0" w:color="000000"/>
+              <w:bottom w:val="single" w:sz="4" w:space="0" w:color="000000"/>
+              <w:right w:val="single" w:sz="4" w:space="0" w:color="000000"/>
+            </w:tcBorders>
           </w:tcPr>
           <w:p>
             <w:r>
@@ -3585,6 +5181,12 @@
         <w:tc>
           <w:tcPr>
             <w:tcW w:type="dxa" w:w="4419"/>
+            <w:tcBorders>
+              <w:top w:val="single" w:sz="4" w:space="0" w:color="000000"/>
+              <w:left w:val="single" w:sz="4" w:space="0" w:color="000000"/>
+              <w:bottom w:val="single" w:sz="4" w:space="0" w:color="000000"/>
+              <w:right w:val="single" w:sz="4" w:space="0" w:color="000000"/>
+            </w:tcBorders>
           </w:tcPr>
           <w:p>
             <w:r>
@@ -3595,6 +5197,12 @@
         <w:tc>
           <w:tcPr>
             <w:tcW w:type="dxa" w:w="4419"/>
+            <w:tcBorders>
+              <w:top w:val="single" w:sz="4" w:space="0" w:color="000000"/>
+              <w:left w:val="single" w:sz="4" w:space="0" w:color="000000"/>
+              <w:bottom w:val="single" w:sz="4" w:space="0" w:color="000000"/>
+              <w:right w:val="single" w:sz="4" w:space="0" w:color="000000"/>
+            </w:tcBorders>
           </w:tcPr>
           <w:p>
             <w:r>
@@ -3607,6 +5215,12 @@
         <w:tc>
           <w:tcPr>
             <w:tcW w:type="dxa" w:w="4419"/>
+            <w:tcBorders>
+              <w:top w:val="single" w:sz="4" w:space="0" w:color="000000"/>
+              <w:left w:val="single" w:sz="4" w:space="0" w:color="000000"/>
+              <w:bottom w:val="single" w:sz="4" w:space="0" w:color="000000"/>
+              <w:right w:val="single" w:sz="4" w:space="0" w:color="000000"/>
+            </w:tcBorders>
           </w:tcPr>
           <w:p>
             <w:r>
@@ -3617,6 +5231,12 @@
         <w:tc>
           <w:tcPr>
             <w:tcW w:type="dxa" w:w="4419"/>
+            <w:tcBorders>
+              <w:top w:val="single" w:sz="4" w:space="0" w:color="000000"/>
+              <w:left w:val="single" w:sz="4" w:space="0" w:color="000000"/>
+              <w:bottom w:val="single" w:sz="4" w:space="0" w:color="000000"/>
+              <w:right w:val="single" w:sz="4" w:space="0" w:color="000000"/>
+            </w:tcBorders>
           </w:tcPr>
           <w:p>
             <w:r>
@@ -3629,6 +5249,12 @@
         <w:tc>
           <w:tcPr>
             <w:tcW w:type="dxa" w:w="4419"/>
+            <w:tcBorders>
+              <w:top w:val="single" w:sz="4" w:space="0" w:color="000000"/>
+              <w:left w:val="single" w:sz="4" w:space="0" w:color="000000"/>
+              <w:bottom w:val="single" w:sz="4" w:space="0" w:color="000000"/>
+              <w:right w:val="single" w:sz="4" w:space="0" w:color="000000"/>
+            </w:tcBorders>
           </w:tcPr>
           <w:p>
             <w:r>
@@ -3639,6 +5265,12 @@
         <w:tc>
           <w:tcPr>
             <w:tcW w:type="dxa" w:w="4419"/>
+            <w:tcBorders>
+              <w:top w:val="single" w:sz="4" w:space="0" w:color="000000"/>
+              <w:left w:val="single" w:sz="4" w:space="0" w:color="000000"/>
+              <w:bottom w:val="single" w:sz="4" w:space="0" w:color="000000"/>
+              <w:right w:val="single" w:sz="4" w:space="0" w:color="000000"/>
+            </w:tcBorders>
           </w:tcPr>
           <w:p>
             <w:r>

</xml_diff>